<commit_message>
Updated default options content docx
</commit_message>
<xml_diff>
--- a/docassemble/AKA2JBranding/data/templates/default_options_content.docx
+++ b/docassemble/AKA2JBranding/data/templates/default_options_content.docx
@@ -518,18 +518,6 @@
         <w:t xml:space="preserve">If the Alaska order is different from the </w:t>
       </w:r>
       <w:r>
-        <w:rPr>
-          <w:strike/>
-        </w:rPr>
-        <w:t>custody</w:t>
-      </w:r>
-      <w:r>
-        <w:t xml:space="preserve"> </w:t>
-      </w:r>
-      <w:r>
-        <w:rPr>
-          <w:color w:val="00B050"/>
-        </w:rPr>
         <w:t>{{ “custody” if user_need == ‘answer custody’ else “court” }}</w:t>
       </w:r>
       <w:r>
@@ -1045,11 +1033,9 @@
       <w:pPr>
         <w:pStyle w:val="Body"/>
         <w:rPr>
-          <w:bCs/>
-        </w:rPr>
-      </w:pPr>
-      <w:commentRangeStart w:id="0"/>
-      <w:commentRangeStart w:id="1"/>
+          <w:color w:val="FFC000"/>
+        </w:rPr>
+      </w:pPr>
       <w:r>
         <w:rPr>
           <w:color w:val="FFC000"/>
@@ -1066,271 +1052,34 @@
         <w:rPr>
           <w:color w:val="FFC000"/>
         </w:rPr>
-        <w:t xml:space="preserve"> if stage_of_default == ‘application filed’ and proper_service %}</w:t>
-      </w:r>
-      <w:r>
-        <w:rPr>
-          <w:bCs/>
-        </w:rPr>
-        <w:t xml:space="preserve">And because </w:t>
-      </w:r>
-      <w:r>
-        <w:rPr>
-          <w:bCs/>
-        </w:rPr>
-        <w:t xml:space="preserve">you did not file an Answer within 20 days of getting the </w:t>
-      </w:r>
-      <w:r>
-        <w:t>Complaint</w:t>
-      </w:r>
-      <w:r>
-        <w:rPr>
-          <w:bCs/>
-        </w:rPr>
-        <w:t>, ask the judge to accept your Answer even though it is late.</w:t>
-      </w:r>
-      <w:r>
-        <w:rPr>
-          <w:bCs/>
-        </w:rPr>
-        <w:t xml:space="preserve"> </w:t>
-      </w:r>
-      <w:r>
-        <w:rPr>
-          <w:bCs/>
-        </w:rPr>
-        <w:t xml:space="preserve">See </w:t>
-      </w:r>
-      <w:r>
-        <w:rPr>
-          <w:bCs/>
-        </w:rPr>
-        <w:t>{</w:t>
-      </w:r>
-      <w:r>
-        <w:rPr>
-          <w:bCs/>
-        </w:rPr>
-        <w:t>{ answer_step.subject }</w:t>
-      </w:r>
-      <w:r>
-        <w:rPr>
-          <w:bCs/>
-        </w:rPr>
-        <w:t>}</w:t>
-      </w:r>
-      <w:r>
-        <w:rPr>
-          <w:bCs/>
-        </w:rPr>
-        <w:t>.</w:t>
+        <w:t xml:space="preserve"> if not proper_service %}</w:t>
       </w:r>
     </w:p>
     <w:p>
       <w:pPr>
         <w:pStyle w:val="Body"/>
         <w:rPr>
-          <w:color w:val="FFC000"/>
-        </w:rPr>
-      </w:pPr>
-      <w:r>
-        <w:rPr>
-          <w:color w:val="FFC000"/>
-        </w:rPr>
-        <w:t>{%</w:t>
-      </w:r>
-      <w:r>
-        <w:rPr>
-          <w:color w:val="FFC000"/>
-        </w:rPr>
-        <w:t>p</w:t>
-      </w:r>
-      <w:r>
-        <w:rPr>
-          <w:color w:val="FFC000"/>
-        </w:rPr>
-        <w:t xml:space="preserve"> endif %}</w:t>
+          <w:rStyle w:val="Heading3Char"/>
+        </w:rPr>
+      </w:pPr>
+      <w:r>
+        <w:rPr>
+          <w:rStyle w:val="Heading3Char"/>
+        </w:rPr>
+        <w:t xml:space="preserve">Option 2. Tell the judge you were not served the correct way and ask </w:t>
+      </w:r>
+      <w:r>
+        <w:rPr>
+          <w:rStyle w:val="Heading3Char"/>
+        </w:rPr>
+        <w:t>to dismiss the case</w:t>
       </w:r>
     </w:p>
     <w:p>
       <w:pPr>
         <w:pStyle w:val="Body"/>
-        <w:rPr>
-          <w:bCs/>
-        </w:rPr>
-      </w:pPr>
-      <w:r>
-        <w:rPr>
-          <w:color w:val="FFC000"/>
-        </w:rPr>
-        <w:t>{%</w:t>
-      </w:r>
-      <w:r>
-        <w:rPr>
-          <w:color w:val="FFC000"/>
-        </w:rPr>
-        <w:t>p</w:t>
-      </w:r>
-      <w:r>
-        <w:rPr>
-          <w:color w:val="FFC000"/>
-        </w:rPr>
-        <w:t xml:space="preserve"> if stage_of_default == 'hearing scheduled' %}</w:t>
-      </w:r>
-      <w:r>
-        <w:t xml:space="preserve">Because the clerk signed the entry of default, you will have to ask the judge to accept your Answer even though it is late. </w:t>
-      </w:r>
-      <w:r>
-        <w:rPr>
-          <w:bCs/>
-        </w:rPr>
-        <w:t xml:space="preserve">See Step </w:t>
-      </w:r>
-      <w:r>
-        <w:rPr>
-          <w:bCs/>
-        </w:rPr>
-        <w:fldChar w:fldCharType="begin"/>
-      </w:r>
-      <w:r>
-        <w:rPr>
-          <w:bCs/>
-        </w:rPr>
-        <w:instrText xml:space="preserve"> REF Answer \h </w:instrText>
-      </w:r>
-      <w:r>
-        <w:rPr>
-          <w:bCs/>
-        </w:rPr>
-      </w:r>
-      <w:r>
-        <w:rPr>
-          <w:bCs/>
-        </w:rPr>
-        <w:fldChar w:fldCharType="separate"/>
-      </w:r>
-      <w:r>
-        <w:rPr>
-          <w:noProof/>
-        </w:rPr>
-        <w:t>8</w:t>
-      </w:r>
-      <w:r>
-        <w:rPr>
-          <w:bCs/>
-        </w:rPr>
-        <w:fldChar w:fldCharType="end"/>
-      </w:r>
-      <w:r>
-        <w:rPr>
-          <w:bCs/>
-        </w:rPr>
-        <w:t xml:space="preserve">: </w:t>
-      </w:r>
-      <w:r>
-        <w:rPr>
-          <w:bCs/>
-        </w:rPr>
-        <w:t>Fill out the forms to respond</w:t>
-      </w:r>
-      <w:r>
-        <w:rPr>
-          <w:bCs/>
-        </w:rPr>
-        <w:t>.</w:t>
-      </w:r>
-    </w:p>
-    <w:p>
-      <w:pPr>
-        <w:pStyle w:val="Body"/>
-      </w:pPr>
-      <w:r>
-        <w:rPr>
-          <w:color w:val="FFC000"/>
-        </w:rPr>
-        <w:t>{%</w:t>
-      </w:r>
-      <w:r>
-        <w:rPr>
-          <w:color w:val="FFC000"/>
-        </w:rPr>
-        <w:t>p</w:t>
-      </w:r>
-      <w:r>
-        <w:rPr>
-          <w:color w:val="FFC000"/>
-        </w:rPr>
-        <w:t xml:space="preserve"> endif %}</w:t>
-      </w:r>
-      <w:commentRangeEnd w:id="0"/>
-      <w:r>
-        <w:rPr>
-          <w:rStyle w:val="CommentReference"/>
-          <w:rFonts w:ascii="Arial" w:eastAsia="Arial" w:hAnsi="Arial" w:cs="Arial"/>
-        </w:rPr>
-        <w:commentReference w:id="0"/>
-      </w:r>
-      <w:commentRangeEnd w:id="1"/>
-      <w:r>
-        <w:rPr>
-          <w:rStyle w:val="CommentReference"/>
-          <w:rFonts w:ascii="Arial" w:eastAsia="Arial" w:hAnsi="Arial" w:cs="Arial"/>
-        </w:rPr>
-        <w:commentReference w:id="1"/>
-      </w:r>
-    </w:p>
-    <w:p>
-      <w:pPr>
-        <w:pStyle w:val="Body"/>
-        <w:rPr>
-          <w:color w:val="FFC000"/>
-        </w:rPr>
-      </w:pPr>
-      <w:r>
-        <w:rPr>
-          <w:color w:val="FFC000"/>
-        </w:rPr>
-        <w:t>{%</w:t>
-      </w:r>
-      <w:r>
-        <w:rPr>
-          <w:color w:val="FFC000"/>
-        </w:rPr>
-        <w:t>p</w:t>
-      </w:r>
-      <w:r>
-        <w:rPr>
-          <w:color w:val="FFC000"/>
-        </w:rPr>
-        <w:t xml:space="preserve"> if not proper_service %}</w:t>
-      </w:r>
-    </w:p>
-    <w:p>
-      <w:pPr>
-        <w:pStyle w:val="Body"/>
-        <w:rPr>
-          <w:rStyle w:val="Heading3Char"/>
-        </w:rPr>
-      </w:pPr>
-      <w:r>
-        <w:rPr>
-          <w:rStyle w:val="Heading3Char"/>
-        </w:rPr>
-        <w:t xml:space="preserve">Option 2. Tell the judge you were not served the correct way and ask </w:t>
-      </w:r>
-      <w:r>
-        <w:rPr>
-          <w:rStyle w:val="Heading3Char"/>
-        </w:rPr>
-        <w:t>to dismiss the case</w:t>
-      </w:r>
-    </w:p>
-    <w:p>
-      <w:pPr>
-        <w:pStyle w:val="Body"/>
-      </w:pPr>
-      <w:r>
-        <w:lastRenderedPageBreak/>
+      </w:pPr>
+      <w:r>
         <w:t xml:space="preserve">If you think you were not served the correct way and you want the court to dismiss the case, you can fill out and file a </w:t>
       </w:r>
       <w:r>
@@ -1349,37 +1098,33 @@
     </w:p>
     <w:p>
       <w:pPr>
+        <w:pStyle w:val="Heading3"/>
+      </w:pPr>
+      <w:r>
+        <w:t>Option 3. Do nothing</w:t>
+      </w:r>
+    </w:p>
+    <w:p>
+      <w:pPr>
         <w:pStyle w:val="Body"/>
       </w:pPr>
-      <w:commentRangeStart w:id="2"/>
-      <w:commentRangeEnd w:id="2"/>
-      <w:r>
-        <w:rPr>
-          <w:rStyle w:val="CommentReference"/>
-          <w:rFonts w:ascii="Arial" w:eastAsia="Arial" w:hAnsi="Arial" w:cs="Arial"/>
-        </w:rPr>
-        <w:commentReference w:id="2"/>
-      </w:r>
-      <w:r>
-        <w:t xml:space="preserve">If </w:t>
-      </w:r>
-      <w:r>
-        <w:t>{</w:t>
-      </w:r>
-      <w:r>
-        <w:t>{</w:t>
-      </w:r>
-      <w:r>
-        <w:t xml:space="preserve"> other_party_in_case </w:t>
-      </w:r>
-      <w:r>
-        <w:t>}</w:t>
-      </w:r>
-      <w:r>
-        <w:t>}</w:t>
-      </w:r>
-      <w:r>
-        <w:t xml:space="preserve"> serves you properly in the future, the court may decide not to dismiss your case. Read Step {{ answer_idx }} to learn about filing an Answer.</w:t>
+      <w:r>
+        <w:rPr>
+          <w:color w:val="FFC000"/>
+        </w:rPr>
+        <w:t>{%</w:t>
+      </w:r>
+      <w:r>
+        <w:rPr>
+          <w:color w:val="FFC000"/>
+        </w:rPr>
+        <w:t>p</w:t>
+      </w:r>
+      <w:r>
+        <w:rPr>
+          <w:color w:val="FFC000"/>
+        </w:rPr>
+        <w:t xml:space="preserve"> else %}</w:t>
       </w:r>
     </w:p>
     <w:p>
@@ -1387,7 +1132,16 @@
         <w:pStyle w:val="Heading3"/>
       </w:pPr>
       <w:r>
-        <w:t>Option 3. Do nothing</w:t>
+        <w:t>Option</w:t>
+      </w:r>
+      <w:r>
+        <w:t xml:space="preserve"> </w:t>
+      </w:r>
+      <w:r>
+        <w:t>2</w:t>
+      </w:r>
+      <w:r>
+        <w:t>. Do nothing</w:t>
       </w:r>
     </w:p>
     <w:p>
@@ -1410,24 +1164,7 @@
         <w:rPr>
           <w:color w:val="FFC000"/>
         </w:rPr>
-        <w:t xml:space="preserve"> else %}</w:t>
-      </w:r>
-    </w:p>
-    <w:p>
-      <w:pPr>
-        <w:pStyle w:val="Heading3"/>
-      </w:pPr>
-      <w:r>
-        <w:t>Option</w:t>
-      </w:r>
-      <w:r>
-        <w:t xml:space="preserve"> </w:t>
-      </w:r>
-      <w:r>
-        <w:t>2</w:t>
-      </w:r>
-      <w:r>
-        <w:t>. Do nothing</w:t>
+        <w:t xml:space="preserve"> endif %}</w:t>
       </w:r>
     </w:p>
     <w:p>
@@ -1435,29 +1172,7 @@
         <w:pStyle w:val="Body"/>
       </w:pPr>
       <w:r>
-        <w:rPr>
-          <w:color w:val="FFC000"/>
-        </w:rPr>
-        <w:t>{%</w:t>
-      </w:r>
-      <w:r>
-        <w:rPr>
-          <w:color w:val="FFC000"/>
-        </w:rPr>
-        <w:t>p</w:t>
-      </w:r>
-      <w:r>
-        <w:rPr>
-          <w:color w:val="FFC000"/>
-        </w:rPr>
-        <w:t xml:space="preserve"> endif %}</w:t>
-      </w:r>
-    </w:p>
-    <w:p>
-      <w:pPr>
-        <w:pStyle w:val="Body"/>
-      </w:pPr>
-      <w:r>
+        <w:lastRenderedPageBreak/>
         <w:t>If you are okay with the judge deciding the case based on {{ other_party_in_case }}’s Complaint, without hearing from you, you do not need to do anything.</w:t>
       </w:r>
     </w:p>
@@ -1507,7 +1222,7 @@
           <w:color w:val="auto"/>
         </w:rPr>
       </w:pPr>
-      <w:hyperlink r:id="rId13" w:history="1">
+      <w:hyperlink r:id="rId9" w:history="1">
         <w:r>
           <w:rPr>
             <w:rStyle w:val="Hyperlink"/>
@@ -1522,7 +1237,7 @@
         </w:rPr>
         <w:br/>
       </w:r>
-      <w:hyperlink r:id="rId14" w:history="1">
+      <w:hyperlink r:id="rId10" w:history="1">
         <w:r>
           <w:rPr>
             <w:rStyle w:val="Hyperlink"/>
@@ -1561,7 +1276,7 @@
           <w:color w:val="auto"/>
         </w:rPr>
       </w:pPr>
-      <w:hyperlink r:id="rId15" w:history="1">
+      <w:hyperlink r:id="rId11" w:history="1">
         <w:r>
           <w:rPr>
             <w:rStyle w:val="Hyperlink"/>
@@ -1576,7 +1291,7 @@
         </w:rPr>
         <w:br/>
       </w:r>
-      <w:hyperlink r:id="rId16" w:history="1">
+      <w:hyperlink r:id="rId12" w:history="1">
         <w:r>
           <w:rPr>
             <w:rStyle w:val="Hyperlink"/>
@@ -1609,7 +1324,7 @@
           <w:color w:val="auto"/>
         </w:rPr>
       </w:pPr>
-      <w:hyperlink r:id="rId17" w:history="1">
+      <w:hyperlink r:id="rId13" w:history="1">
         <w:r>
           <w:rPr>
             <w:rStyle w:val="Hyperlink"/>
@@ -1624,7 +1339,7 @@
         </w:rPr>
         <w:br/>
       </w:r>
-      <w:hyperlink r:id="rId18" w:history="1">
+      <w:hyperlink r:id="rId14" w:history="1">
         <w:r>
           <w:rPr>
             <w:rStyle w:val="Hyperlink"/>
@@ -1645,28 +1360,7 @@
           <w:rStyle w:val="Hyperlink"/>
           <w:color w:val="FFC000"/>
         </w:rPr>
-        <w:t>{%</w:t>
-      </w:r>
-      <w:r>
-        <w:rPr>
-          <w:rStyle w:val="Hyperlink"/>
-          <w:color w:val="FFC000"/>
-        </w:rPr>
-        <w:t xml:space="preserve">p </w:t>
-      </w:r>
-      <w:r>
-        <w:rPr>
-          <w:rStyle w:val="Hyperlink"/>
-          <w:color w:val="FFC000"/>
-        </w:rPr>
-        <w:t>endif</w:t>
-      </w:r>
-      <w:r>
-        <w:rPr>
-          <w:rStyle w:val="Hyperlink"/>
-          <w:color w:val="FFC000"/>
-        </w:rPr>
-        <w:t xml:space="preserve"> %}</w:t>
+        <w:t>{%p endif %}</w:t>
       </w:r>
     </w:p>
     <w:p>
@@ -1706,81 +1400,6 @@
     </w:sectPr>
   </w:body>
 </w:document>
-</file>
-
-<file path=word/comments.xml><?xml version="1.0" encoding="utf-8"?>
-<w:comments xmlns:wpc="http://schemas.microsoft.com/office/word/2010/wordprocessingCanvas" xmlns:cx="http://schemas.microsoft.com/office/drawing/2014/chartex" xmlns:cx1="http://schemas.microsoft.com/office/drawing/2015/9/8/chartex" xmlns:cx2="http://schemas.microsoft.com/office/drawing/2015/10/21/chartex" xmlns:cx3="http://schemas.microsoft.com/office/drawing/2016/5/9/chartex" xmlns:cx4="http://schemas.microsoft.com/office/drawing/2016/5/10/chartex" xmlns:cx5="http://schemas.microsoft.com/office/drawing/2016/5/11/chartex" xmlns:cx6="http://schemas.microsoft.com/office/drawing/2016/5/12/chartex" xmlns:cx7="http://schemas.microsoft.com/office/drawing/2016/5/13/chartex" xmlns:cx8="http://schemas.microsoft.com/office/drawing/2016/5/14/chartex" xmlns:mc="http://schemas.openxmlformats.org/markup-compatibility/2006" xmlns:aink="http://schemas.microsoft.com/office/drawing/2016/ink" xmlns:am3d="http://schemas.microsoft.com/office/drawing/2017/model3d" xmlns:o="urn:schemas-microsoft-com:office:office" xmlns:r="http://schemas.openxmlformats.org/officeDocument/2006/relationships" xmlns:m="http://schemas.openxmlformats.org/officeDocument/2006/math" xmlns:v="urn:schemas-microsoft-com:vml" xmlns:wp14="http://schemas.microsoft.com/office/word/2010/wordprocessingDrawing" xmlns:wp="http://schemas.openxmlformats.org/drawingml/2006/wordprocessingDrawing" xmlns:w10="urn:schemas-microsoft-com:office:word" xmlns:w="http://schemas.openxmlformats.org/wordprocessingml/2006/main" xmlns:w14="http://schemas.microsoft.com/office/word/2010/wordml" xmlns:w15="http://schemas.microsoft.com/office/word/2012/wordml" xmlns:w16cex="http://schemas.microsoft.com/office/word/2018/wordml/cex" xmlns:w16cid="http://schemas.microsoft.com/office/word/2016/wordml/cid" xmlns:w16="http://schemas.microsoft.com/office/word/2018/wordml" xmlns:w16sdtdh="http://schemas.microsoft.com/office/word/2020/wordml/sdtdatahash" xmlns:w16se="http://schemas.microsoft.com/office/word/2015/wordml/symex" xmlns:wpg="http://schemas.microsoft.com/office/word/2010/wordprocessingGroup" xmlns:wpi="http://schemas.microsoft.com/office/word/2010/wordprocessingInk" xmlns:wne="http://schemas.microsoft.com/office/word/2006/wordml" xmlns:wps="http://schemas.microsoft.com/office/word/2010/wordprocessingShape" mc:Ignorable="w14 w15 w16se w16cid w16 w16cex w16sdtdh wp14">
-  <w:comment w:id="0" w:author="Caroline Robinson" w:date="2025-06-18T08:38:00Z" w:initials="CR">
-    <w:p>
-      <w:pPr>
-        <w:pStyle w:val="CommentText"/>
-      </w:pPr>
-      <w:r>
-        <w:rPr>
-          <w:rStyle w:val="CommentReference"/>
-        </w:rPr>
-        <w:annotationRef/>
-      </w:r>
-      <w:r>
-        <w:t>Move to answer step</w:t>
-      </w:r>
-    </w:p>
-  </w:comment>
-  <w:comment w:id="1" w:author="Caroline Robinson" w:date="2025-07-17T15:02:00Z" w:initials="CR">
-    <w:p>
-      <w:pPr>
-        <w:pStyle w:val="CommentText"/>
-      </w:pPr>
-      <w:r>
-        <w:rPr>
-          <w:rStyle w:val="CommentReference"/>
-        </w:rPr>
-        <w:annotationRef/>
-      </w:r>
-      <w:r>
-        <w:t xml:space="preserve">Moved the form details updated the text I think it's updated in html also </w:t>
-      </w:r>
-    </w:p>
-  </w:comment>
-  <w:comment w:id="2" w:author="Caroline Robinson" w:date="2025-06-18T08:39:00Z" w:initials="CR">
-    <w:p>
-      <w:pPr>
-        <w:pStyle w:val="CommentText"/>
-      </w:pPr>
-      <w:r>
-        <w:rPr>
-          <w:rStyle w:val="CommentReference"/>
-        </w:rPr>
-        <w:annotationRef/>
-      </w:r>
-      <w:r>
-        <w:t>Move bak to dismiss step</w:t>
-      </w:r>
-    </w:p>
-  </w:comment>
-</w:comments>
-</file>
-
-<file path=word/commentsExtended.xml><?xml version="1.0" encoding="utf-8"?>
-<w15:commentsEx xmlns:wpc="http://schemas.microsoft.com/office/word/2010/wordprocessingCanvas" xmlns:cx="http://schemas.microsoft.com/office/drawing/2014/chartex" xmlns:cx1="http://schemas.microsoft.com/office/drawing/2015/9/8/chartex" xmlns:cx2="http://schemas.microsoft.com/office/drawing/2015/10/21/chartex" xmlns:cx3="http://schemas.microsoft.com/office/drawing/2016/5/9/chartex" xmlns:cx4="http://schemas.microsoft.com/office/drawing/2016/5/10/chartex" xmlns:cx5="http://schemas.microsoft.com/office/drawing/2016/5/11/chartex" xmlns:cx6="http://schemas.microsoft.com/office/drawing/2016/5/12/chartex" xmlns:cx7="http://schemas.microsoft.com/office/drawing/2016/5/13/chartex" xmlns:cx8="http://schemas.microsoft.com/office/drawing/2016/5/14/chartex" xmlns:mc="http://schemas.openxmlformats.org/markup-compatibility/2006" xmlns:aink="http://schemas.microsoft.com/office/drawing/2016/ink" xmlns:am3d="http://schemas.microsoft.com/office/drawing/2017/model3d" xmlns:o="urn:schemas-microsoft-com:office:office" xmlns:r="http://schemas.openxmlformats.org/officeDocument/2006/relationships" xmlns:m="http://schemas.openxmlformats.org/officeDocument/2006/math" xmlns:v="urn:schemas-microsoft-com:vml" xmlns:wp14="http://schemas.microsoft.com/office/word/2010/wordprocessingDrawing" xmlns:wp="http://schemas.openxmlformats.org/drawingml/2006/wordprocessingDrawing" xmlns:w10="urn:schemas-microsoft-com:office:word" xmlns:w="http://schemas.openxmlformats.org/wordprocessingml/2006/main" xmlns:w14="http://schemas.microsoft.com/office/word/2010/wordml" xmlns:w15="http://schemas.microsoft.com/office/word/2012/wordml" xmlns:w16cex="http://schemas.microsoft.com/office/word/2018/wordml/cex" xmlns:w16cid="http://schemas.microsoft.com/office/word/2016/wordml/cid" xmlns:w16="http://schemas.microsoft.com/office/word/2018/wordml" xmlns:w16sdtdh="http://schemas.microsoft.com/office/word/2020/wordml/sdtdatahash" xmlns:w16se="http://schemas.microsoft.com/office/word/2015/wordml/symex" xmlns:wpg="http://schemas.microsoft.com/office/word/2010/wordprocessingGroup" xmlns:wpi="http://schemas.microsoft.com/office/word/2010/wordprocessingInk" xmlns:wne="http://schemas.microsoft.com/office/word/2006/wordml" xmlns:wps="http://schemas.microsoft.com/office/word/2010/wordprocessingShape" mc:Ignorable="w14 w15 w16se w16cid w16 w16cex w16sdtdh wp14">
-  <w15:commentEx w15:paraId="43307418" w15:done="0"/>
-  <w15:commentEx w15:paraId="34E28241" w15:paraIdParent="43307418" w15:done="0"/>
-  <w15:commentEx w15:paraId="70ABC0AA" w15:done="0"/>
-</w15:commentsEx>
-</file>
-
-<file path=word/commentsExtensible.xml><?xml version="1.0" encoding="utf-8"?>
-<w16cex:commentsExtensible xmlns:wpc="http://schemas.microsoft.com/office/word/2010/wordprocessingCanvas" xmlns:cx="http://schemas.microsoft.com/office/drawing/2014/chartex" xmlns:cx1="http://schemas.microsoft.com/office/drawing/2015/9/8/chartex" xmlns:cx2="http://schemas.microsoft.com/office/drawing/2015/10/21/chartex" xmlns:cx3="http://schemas.microsoft.com/office/drawing/2016/5/9/chartex" xmlns:cx4="http://schemas.microsoft.com/office/drawing/2016/5/10/chartex" xmlns:cx5="http://schemas.microsoft.com/office/drawing/2016/5/11/chartex" xmlns:cx6="http://schemas.microsoft.com/office/drawing/2016/5/12/chartex" xmlns:cx7="http://schemas.microsoft.com/office/drawing/2016/5/13/chartex" xmlns:cx8="http://schemas.microsoft.com/office/drawing/2016/5/14/chartex" xmlns:mc="http://schemas.openxmlformats.org/markup-compatibility/2006" xmlns:aink="http://schemas.microsoft.com/office/drawing/2016/ink" xmlns:am3d="http://schemas.microsoft.com/office/drawing/2017/model3d" xmlns:o="urn:schemas-microsoft-com:office:office" xmlns:r="http://schemas.openxmlformats.org/officeDocument/2006/relationships" xmlns:m="http://schemas.openxmlformats.org/officeDocument/2006/math" xmlns:v="urn:schemas-microsoft-com:vml" xmlns:wp14="http://schemas.microsoft.com/office/word/2010/wordprocessingDrawing" xmlns:wp="http://schemas.openxmlformats.org/drawingml/2006/wordprocessingDrawing" xmlns:w10="urn:schemas-microsoft-com:office:word" xmlns:w="http://schemas.openxmlformats.org/wordprocessingml/2006/main" xmlns:w14="http://schemas.microsoft.com/office/word/2010/wordml" xmlns:w15="http://schemas.microsoft.com/office/word/2012/wordml" xmlns:w16cex="http://schemas.microsoft.com/office/word/2018/wordml/cex" xmlns:w16cid="http://schemas.microsoft.com/office/word/2016/wordml/cid" xmlns:w16="http://schemas.microsoft.com/office/word/2018/wordml" xmlns:w16sdtdh="http://schemas.microsoft.com/office/word/2020/wordml/sdtdatahash" xmlns:w16se="http://schemas.microsoft.com/office/word/2015/wordml/symex" xmlns:wpg="http://schemas.microsoft.com/office/word/2010/wordprocessingGroup" xmlns:wpi="http://schemas.microsoft.com/office/word/2010/wordprocessingInk" xmlns:wne="http://schemas.microsoft.com/office/word/2006/wordml" xmlns:wps="http://schemas.microsoft.com/office/word/2010/wordprocessingShape" mc:Ignorable="w14 w15 w16se w16cid w16 w16cex w16sdtdh wp14">
-  <w16cex:commentExtensible w16cex:durableId="2D838910" w16cex:dateUtc="2025-07-17T23:02:00Z"/>
-</w16cex:commentsExtensible>
-</file>
-
-<file path=word/commentsIds.xml><?xml version="1.0" encoding="utf-8"?>
-<w16cid:commentsIds xmlns:wpc="http://schemas.microsoft.com/office/word/2010/wordprocessingCanvas" xmlns:cx="http://schemas.microsoft.com/office/drawing/2014/chartex" xmlns:cx1="http://schemas.microsoft.com/office/drawing/2015/9/8/chartex" xmlns:cx2="http://schemas.microsoft.com/office/drawing/2015/10/21/chartex" xmlns:cx3="http://schemas.microsoft.com/office/drawing/2016/5/9/chartex" xmlns:cx4="http://schemas.microsoft.com/office/drawing/2016/5/10/chartex" xmlns:cx5="http://schemas.microsoft.com/office/drawing/2016/5/11/chartex" xmlns:cx6="http://schemas.microsoft.com/office/drawing/2016/5/12/chartex" xmlns:cx7="http://schemas.microsoft.com/office/drawing/2016/5/13/chartex" xmlns:cx8="http://schemas.microsoft.com/office/drawing/2016/5/14/chartex" xmlns:mc="http://schemas.openxmlformats.org/markup-compatibility/2006" xmlns:aink="http://schemas.microsoft.com/office/drawing/2016/ink" xmlns:am3d="http://schemas.microsoft.com/office/drawing/2017/model3d" xmlns:o="urn:schemas-microsoft-com:office:office" xmlns:r="http://schemas.openxmlformats.org/officeDocument/2006/relationships" xmlns:m="http://schemas.openxmlformats.org/officeDocument/2006/math" xmlns:v="urn:schemas-microsoft-com:vml" xmlns:wp14="http://schemas.microsoft.com/office/word/2010/wordprocessingDrawing" xmlns:wp="http://schemas.openxmlformats.org/drawingml/2006/wordprocessingDrawing" xmlns:w10="urn:schemas-microsoft-com:office:word" xmlns:w="http://schemas.openxmlformats.org/wordprocessingml/2006/main" xmlns:w14="http://schemas.microsoft.com/office/word/2010/wordml" xmlns:w15="http://schemas.microsoft.com/office/word/2012/wordml" xmlns:w16cex="http://schemas.microsoft.com/office/word/2018/wordml/cex" xmlns:w16cid="http://schemas.microsoft.com/office/word/2016/wordml/cid" xmlns:w16="http://schemas.microsoft.com/office/word/2018/wordml" xmlns:w16sdtdh="http://schemas.microsoft.com/office/word/2020/wordml/sdtdatahash" xmlns:w16se="http://schemas.microsoft.com/office/word/2015/wordml/symex" xmlns:wpg="http://schemas.microsoft.com/office/word/2010/wordprocessingGroup" xmlns:wpi="http://schemas.microsoft.com/office/word/2010/wordprocessingInk" xmlns:wne="http://schemas.microsoft.com/office/word/2006/wordml" xmlns:wps="http://schemas.microsoft.com/office/word/2010/wordprocessingShape" mc:Ignorable="w14 w15 w16se w16cid w16 w16cex w16sdtdh wp14">
-  <w16cid:commentId w16cid:paraId="43307418" w16cid:durableId="2D838911"/>
-  <w16cid:commentId w16cid:paraId="34E28241" w16cid:durableId="2D838910"/>
-  <w16cid:commentId w16cid:paraId="70ABC0AA" w16cid:durableId="2D8389E4"/>
-</w16cid:commentsIds>
 </file>
 
 <file path=word/numbering.xml><?xml version="1.0" encoding="utf-8"?>
@@ -3163,14 +2782,6 @@
   </w:num>
   <w:numIdMacAtCleanup w:val="14"/>
 </w:numbering>
-</file>
-
-<file path=word/people.xml><?xml version="1.0" encoding="utf-8"?>
-<w15:people xmlns:wpc="http://schemas.microsoft.com/office/word/2010/wordprocessingCanvas" xmlns:cx="http://schemas.microsoft.com/office/drawing/2014/chartex" xmlns:cx1="http://schemas.microsoft.com/office/drawing/2015/9/8/chartex" xmlns:cx2="http://schemas.microsoft.com/office/drawing/2015/10/21/chartex" xmlns:cx3="http://schemas.microsoft.com/office/drawing/2016/5/9/chartex" xmlns:cx4="http://schemas.microsoft.com/office/drawing/2016/5/10/chartex" xmlns:cx5="http://schemas.microsoft.com/office/drawing/2016/5/11/chartex" xmlns:cx6="http://schemas.microsoft.com/office/drawing/2016/5/12/chartex" xmlns:cx7="http://schemas.microsoft.com/office/drawing/2016/5/13/chartex" xmlns:cx8="http://schemas.microsoft.com/office/drawing/2016/5/14/chartex" xmlns:mc="http://schemas.openxmlformats.org/markup-compatibility/2006" xmlns:aink="http://schemas.microsoft.com/office/drawing/2016/ink" xmlns:am3d="http://schemas.microsoft.com/office/drawing/2017/model3d" xmlns:o="urn:schemas-microsoft-com:office:office" xmlns:r="http://schemas.openxmlformats.org/officeDocument/2006/relationships" xmlns:m="http://schemas.openxmlformats.org/officeDocument/2006/math" xmlns:v="urn:schemas-microsoft-com:vml" xmlns:wp14="http://schemas.microsoft.com/office/word/2010/wordprocessingDrawing" xmlns:wp="http://schemas.openxmlformats.org/drawingml/2006/wordprocessingDrawing" xmlns:w10="urn:schemas-microsoft-com:office:word" xmlns:w="http://schemas.openxmlformats.org/wordprocessingml/2006/main" xmlns:w14="http://schemas.microsoft.com/office/word/2010/wordml" xmlns:w15="http://schemas.microsoft.com/office/word/2012/wordml" xmlns:w16cex="http://schemas.microsoft.com/office/word/2018/wordml/cex" xmlns:w16cid="http://schemas.microsoft.com/office/word/2016/wordml/cid" xmlns:w16="http://schemas.microsoft.com/office/word/2018/wordml" xmlns:w16sdtdh="http://schemas.microsoft.com/office/word/2020/wordml/sdtdatahash" xmlns:w16se="http://schemas.microsoft.com/office/word/2015/wordml/symex" xmlns:wpg="http://schemas.microsoft.com/office/word/2010/wordprocessingGroup" xmlns:wpi="http://schemas.microsoft.com/office/word/2010/wordprocessingInk" xmlns:wne="http://schemas.microsoft.com/office/word/2006/wordml" xmlns:wps="http://schemas.microsoft.com/office/word/2010/wordprocessingShape" mc:Ignorable="w14 w15 w16se w16cid w16 w16cex w16sdtdh wp14">
-  <w15:person w15:author="Caroline Robinson">
-    <w15:presenceInfo w15:providerId="AD" w15:userId="S::crobinson@akcourts.gov::90d5f6fb-be36-42a5-b1db-9f4aa0bce5fa"/>
-  </w15:person>
-</w15:people>
 </file>
 
 <file path=word/styles.xml><?xml version="1.0" encoding="utf-8"?>

</xml_diff>

<commit_message>
adding signing paragraph and step md templates, added docx templates, sigining, process, alternate service, updated get help, new expect_after_motion_or_answer docx and mako, standing order docx and mako, alternate service docx default info docx
</commit_message>
<xml_diff>
--- a/docassemble/AKA2JBranding/data/templates/default_options_content.docx
+++ b/docassemble/AKA2JBranding/data/templates/default_options_content.docx
@@ -376,7 +376,23 @@
         <w:pStyle w:val="Body"/>
       </w:pPr>
       <w:r>
-        <w:t>Read about asking the judge to set aside the default judgment in steps {{ learn_set_aside_idx }} and {{ fill_set_aside_idx }}</w:t>
+        <w:t xml:space="preserve">Read about asking the judge to set aside the default judgment in steps {{ </w:t>
+      </w:r>
+      <w:proofErr w:type="spellStart"/>
+      <w:r>
+        <w:t>learn_set_aside_idx</w:t>
+      </w:r>
+      <w:proofErr w:type="spellEnd"/>
+      <w:r>
+        <w:t xml:space="preserve"> }} and {{ </w:t>
+      </w:r>
+      <w:proofErr w:type="spellStart"/>
+      <w:r>
+        <w:t>fill_set_aside_idx</w:t>
+      </w:r>
+      <w:proofErr w:type="spellEnd"/>
+      <w:r>
+        <w:t xml:space="preserve"> }}</w:t>
       </w:r>
     </w:p>
     <w:p>
@@ -518,6 +534,18 @@
         <w:t xml:space="preserve">If the Alaska order is different from the </w:t>
       </w:r>
       <w:r>
+        <w:rPr>
+          <w:strike/>
+        </w:rPr>
+        <w:t>custody</w:t>
+      </w:r>
+      <w:r>
+        <w:t xml:space="preserve"> </w:t>
+      </w:r>
+      <w:r>
+        <w:rPr>
+          <w:color w:val="00B050"/>
+        </w:rPr>
         <w:t>{{ “custody” if user_need == ‘answer custody’ else “court” }}</w:t>
       </w:r>
       <w:r>
@@ -951,10 +979,13 @@
         <w:t>end your marriage</w:t>
       </w:r>
       <w:r>
-        <w:rPr>
-          <w:color w:val="FFC000"/>
-        </w:rPr>
-        <w:t>.{% endif %}</w:t>
+        <w:t>.</w:t>
+      </w:r>
+      <w:r>
+        <w:rPr>
+          <w:color w:val="FFC000"/>
+        </w:rPr>
+        <w:t>{% endif %}</w:t>
       </w:r>
       <w:r>
         <w:rPr>
@@ -1033,9 +1064,11 @@
       <w:pPr>
         <w:pStyle w:val="Body"/>
         <w:rPr>
-          <w:color w:val="FFC000"/>
-        </w:rPr>
-      </w:pPr>
+          <w:bCs/>
+        </w:rPr>
+      </w:pPr>
+      <w:commentRangeStart w:id="0"/>
+      <w:commentRangeStart w:id="1"/>
       <w:r>
         <w:rPr>
           <w:color w:val="FFC000"/>
@@ -1052,6 +1085,256 @@
         <w:rPr>
           <w:color w:val="FFC000"/>
         </w:rPr>
+        <w:t xml:space="preserve"> if stage_of_default == ‘application filed’ and proper_service %}</w:t>
+      </w:r>
+      <w:r>
+        <w:rPr>
+          <w:bCs/>
+        </w:rPr>
+        <w:t xml:space="preserve">And because </w:t>
+      </w:r>
+      <w:r>
+        <w:rPr>
+          <w:bCs/>
+        </w:rPr>
+        <w:t xml:space="preserve">you did not file an Answer within 20 days of getting the </w:t>
+      </w:r>
+      <w:r>
+        <w:t>Complaint</w:t>
+      </w:r>
+      <w:r>
+        <w:rPr>
+          <w:bCs/>
+        </w:rPr>
+        <w:t>, ask the judge to accept your Answer even though it is late.</w:t>
+      </w:r>
+      <w:r>
+        <w:rPr>
+          <w:bCs/>
+        </w:rPr>
+        <w:t xml:space="preserve"> </w:t>
+      </w:r>
+      <w:r>
+        <w:rPr>
+          <w:bCs/>
+        </w:rPr>
+        <w:t xml:space="preserve">See </w:t>
+      </w:r>
+      <w:r>
+        <w:rPr>
+          <w:bCs/>
+        </w:rPr>
+        <w:t>{</w:t>
+      </w:r>
+      <w:r>
+        <w:rPr>
+          <w:bCs/>
+        </w:rPr>
+        <w:t xml:space="preserve">{ </w:t>
+      </w:r>
+      <w:proofErr w:type="spellStart"/>
+      <w:r>
+        <w:rPr>
+          <w:bCs/>
+        </w:rPr>
+        <w:t>answer_step.subject</w:t>
+      </w:r>
+      <w:proofErr w:type="spellEnd"/>
+      <w:r>
+        <w:rPr>
+          <w:bCs/>
+        </w:rPr>
+        <w:t xml:space="preserve"> }</w:t>
+      </w:r>
+      <w:r>
+        <w:rPr>
+          <w:bCs/>
+        </w:rPr>
+        <w:t>}</w:t>
+      </w:r>
+      <w:r>
+        <w:rPr>
+          <w:bCs/>
+        </w:rPr>
+        <w:t>.</w:t>
+      </w:r>
+    </w:p>
+    <w:p>
+      <w:pPr>
+        <w:pStyle w:val="Body"/>
+        <w:rPr>
+          <w:color w:val="FFC000"/>
+        </w:rPr>
+      </w:pPr>
+      <w:r>
+        <w:rPr>
+          <w:color w:val="FFC000"/>
+        </w:rPr>
+        <w:t>{%</w:t>
+      </w:r>
+      <w:r>
+        <w:rPr>
+          <w:color w:val="FFC000"/>
+        </w:rPr>
+        <w:t>p</w:t>
+      </w:r>
+      <w:r>
+        <w:rPr>
+          <w:color w:val="FFC000"/>
+        </w:rPr>
+        <w:t xml:space="preserve"> endif %}</w:t>
+      </w:r>
+    </w:p>
+    <w:p>
+      <w:pPr>
+        <w:pStyle w:val="Body"/>
+        <w:rPr>
+          <w:bCs/>
+        </w:rPr>
+      </w:pPr>
+      <w:r>
+        <w:rPr>
+          <w:color w:val="FFC000"/>
+        </w:rPr>
+        <w:t>{%</w:t>
+      </w:r>
+      <w:r>
+        <w:rPr>
+          <w:color w:val="FFC000"/>
+        </w:rPr>
+        <w:t>p</w:t>
+      </w:r>
+      <w:r>
+        <w:rPr>
+          <w:color w:val="FFC000"/>
+        </w:rPr>
+        <w:t xml:space="preserve"> if stage_of_default == 'hearing scheduled' %}</w:t>
+      </w:r>
+      <w:r>
+        <w:t xml:space="preserve">Because the clerk signed the entry of default, you will have to ask the judge to accept your Answer even though it is late. </w:t>
+      </w:r>
+      <w:r>
+        <w:rPr>
+          <w:bCs/>
+        </w:rPr>
+        <w:t xml:space="preserve">See Step </w:t>
+      </w:r>
+      <w:r>
+        <w:rPr>
+          <w:bCs/>
+        </w:rPr>
+        <w:fldChar w:fldCharType="begin"/>
+      </w:r>
+      <w:r>
+        <w:rPr>
+          <w:bCs/>
+        </w:rPr>
+        <w:instrText xml:space="preserve"> REF Answer \h </w:instrText>
+      </w:r>
+      <w:r>
+        <w:rPr>
+          <w:bCs/>
+        </w:rPr>
+      </w:r>
+      <w:r>
+        <w:rPr>
+          <w:bCs/>
+        </w:rPr>
+        <w:fldChar w:fldCharType="separate"/>
+      </w:r>
+      <w:r>
+        <w:rPr>
+          <w:noProof/>
+        </w:rPr>
+        <w:t>8</w:t>
+      </w:r>
+      <w:r>
+        <w:rPr>
+          <w:bCs/>
+        </w:rPr>
+        <w:fldChar w:fldCharType="end"/>
+      </w:r>
+      <w:r>
+        <w:rPr>
+          <w:bCs/>
+        </w:rPr>
+        <w:t xml:space="preserve">: </w:t>
+      </w:r>
+      <w:r>
+        <w:rPr>
+          <w:bCs/>
+        </w:rPr>
+        <w:t>Fill out the forms to respond</w:t>
+      </w:r>
+      <w:r>
+        <w:rPr>
+          <w:bCs/>
+        </w:rPr>
+        <w:t>.</w:t>
+      </w:r>
+    </w:p>
+    <w:p>
+      <w:pPr>
+        <w:pStyle w:val="Body"/>
+      </w:pPr>
+      <w:r>
+        <w:rPr>
+          <w:color w:val="FFC000"/>
+        </w:rPr>
+        <w:t>{%</w:t>
+      </w:r>
+      <w:r>
+        <w:rPr>
+          <w:color w:val="FFC000"/>
+        </w:rPr>
+        <w:t>p</w:t>
+      </w:r>
+      <w:r>
+        <w:rPr>
+          <w:color w:val="FFC000"/>
+        </w:rPr>
+        <w:t xml:space="preserve"> endif %}</w:t>
+      </w:r>
+      <w:commentRangeEnd w:id="0"/>
+      <w:r>
+        <w:rPr>
+          <w:rStyle w:val="CommentReference"/>
+          <w:rFonts w:ascii="Arial" w:eastAsia="Arial" w:hAnsi="Arial" w:cs="Arial"/>
+        </w:rPr>
+        <w:commentReference w:id="0"/>
+      </w:r>
+      <w:commentRangeEnd w:id="1"/>
+      <w:r>
+        <w:rPr>
+          <w:rStyle w:val="CommentReference"/>
+          <w:rFonts w:ascii="Arial" w:eastAsia="Arial" w:hAnsi="Arial" w:cs="Arial"/>
+        </w:rPr>
+        <w:commentReference w:id="1"/>
+      </w:r>
+    </w:p>
+    <w:p>
+      <w:pPr>
+        <w:pStyle w:val="Body"/>
+        <w:rPr>
+          <w:color w:val="FFC000"/>
+        </w:rPr>
+      </w:pPr>
+      <w:r>
+        <w:rPr>
+          <w:color w:val="FFC000"/>
+        </w:rPr>
+        <w:t>{%</w:t>
+      </w:r>
+      <w:r>
+        <w:rPr>
+          <w:color w:val="FFC000"/>
+        </w:rPr>
+        <w:t>p</w:t>
+      </w:r>
+      <w:r>
+        <w:rPr>
+          <w:color w:val="FFC000"/>
+        </w:rPr>
         <w:t xml:space="preserve"> if not proper_service %}</w:t>
       </w:r>
     </w:p>
@@ -1080,6 +1363,7 @@
         <w:pStyle w:val="Body"/>
       </w:pPr>
       <w:r>
+        <w:lastRenderedPageBreak/>
         <w:t xml:space="preserve">If you think you were not served the correct way and you want the court to dismiss the case, you can fill out and file a </w:t>
       </w:r>
       <w:r>
@@ -1098,6 +1382,41 @@
     </w:p>
     <w:p>
       <w:pPr>
+        <w:pStyle w:val="Body"/>
+      </w:pPr>
+      <w:commentRangeStart w:id="2"/>
+      <w:commentRangeEnd w:id="2"/>
+      <w:r>
+        <w:rPr>
+          <w:rStyle w:val="CommentReference"/>
+          <w:rFonts w:ascii="Arial" w:eastAsia="Arial" w:hAnsi="Arial" w:cs="Arial"/>
+        </w:rPr>
+        <w:commentReference w:id="2"/>
+      </w:r>
+      <w:r>
+        <w:t xml:space="preserve">If </w:t>
+      </w:r>
+      <w:r>
+        <w:t>{</w:t>
+      </w:r>
+      <w:r>
+        <w:t>{</w:t>
+      </w:r>
+      <w:r>
+        <w:t xml:space="preserve"> other_party_in_case </w:t>
+      </w:r>
+      <w:r>
+        <w:t>}</w:t>
+      </w:r>
+      <w:r>
+        <w:t>}</w:t>
+      </w:r>
+      <w:r>
+        <w:t xml:space="preserve"> serves you properly in the future, the court may decide not to dismiss your case. Read Step {{ answer_idx }} to learn about filing an Answer.</w:t>
+      </w:r>
+    </w:p>
+    <w:p>
+      <w:pPr>
         <w:pStyle w:val="Heading3"/>
       </w:pPr>
       <w:r>
@@ -1172,7 +1491,6 @@
         <w:pStyle w:val="Body"/>
       </w:pPr>
       <w:r>
-        <w:lastRenderedPageBreak/>
         <w:t>If you are okay with the judge deciding the case based on {{ other_party_in_case }}’s Complaint, without hearing from you, you do not need to do anything.</w:t>
       </w:r>
     </w:p>
@@ -1195,201 +1513,12 @@
     <w:p>
       <w:pPr>
         <w:pStyle w:val="Body"/>
+      </w:pPr>
+      <w:r>
         <w:rPr>
           <w:color w:val="FF0000"/>
         </w:rPr>
-      </w:pPr>
-      <w:r>
-        <w:rPr>
-          <w:color w:val="FF0000"/>
-        </w:rPr>
         <w:t>{%p endif %}</w:t>
-      </w:r>
-    </w:p>
-    <w:p>
-      <w:pPr>
-        <w:pStyle w:val="Heading3"/>
-      </w:pPr>
-      <w:r>
-        <w:t>Links in this step</w:t>
-      </w:r>
-    </w:p>
-    <w:p>
-      <w:pPr>
-        <w:pStyle w:val="Body"/>
-        <w:rPr>
-          <w:rStyle w:val="Hyperlink"/>
-          <w:color w:val="auto"/>
-        </w:rPr>
-      </w:pPr>
-      <w:hyperlink r:id="rId9" w:history="1">
-        <w:r>
-          <w:rPr>
-            <w:rStyle w:val="Hyperlink"/>
-          </w:rPr>
-          <w:t>getting copies of your court file</w:t>
-        </w:r>
-      </w:hyperlink>
-      <w:r>
-        <w:rPr>
-          <w:rStyle w:val="Hyperlink"/>
-          <w:color w:val="auto"/>
-        </w:rPr>
-        <w:br/>
-      </w:r>
-      <w:hyperlink r:id="rId10" w:history="1">
-        <w:r>
-          <w:rPr>
-            <w:rStyle w:val="Hyperlink"/>
-          </w:rPr>
-          <w:t>ak-courts.info/recordsrequest</w:t>
-        </w:r>
-      </w:hyperlink>
-    </w:p>
-    <w:p>
-      <w:pPr>
-        <w:pStyle w:val="Body"/>
-      </w:pPr>
-      <w:r>
-        <w:rPr>
-          <w:color w:val="FF0000"/>
-        </w:rPr>
-        <w:t>{%p if stage_of_default == 'judgment entered' %}</w:t>
-      </w:r>
-    </w:p>
-    <w:p>
-      <w:pPr>
-        <w:pStyle w:val="Body"/>
-      </w:pPr>
-      <w:r>
-        <w:rPr>
-          <w:color w:val="FFC000"/>
-        </w:rPr>
-        <w:t>{%p if type_of_response['case in 2 states'] and stage_of_case == 'ended with order' %}</w:t>
-      </w:r>
-    </w:p>
-    <w:p>
-      <w:pPr>
-        <w:pStyle w:val="Body"/>
-        <w:rPr>
-          <w:rStyle w:val="Hyperlink"/>
-          <w:color w:val="auto"/>
-        </w:rPr>
-      </w:pPr>
-      <w:hyperlink r:id="rId11" w:history="1">
-        <w:r>
-          <w:rPr>
-            <w:rStyle w:val="Hyperlink"/>
-          </w:rPr>
-          <w:t>talk to a lawyer</w:t>
-        </w:r>
-      </w:hyperlink>
-      <w:r>
-        <w:rPr>
-          <w:rStyle w:val="Hyperlink"/>
-          <w:color w:val="auto"/>
-        </w:rPr>
-        <w:br/>
-      </w:r>
-      <w:hyperlink r:id="rId12" w:history="1">
-        <w:r>
-          <w:rPr>
-            <w:rStyle w:val="Hyperlink"/>
-          </w:rPr>
-          <w:t>ak-courts.info/findlawyer</w:t>
-        </w:r>
-      </w:hyperlink>
-    </w:p>
-    <w:p>
-      <w:pPr>
-        <w:pStyle w:val="Body"/>
-        <w:rPr>
-          <w:rStyle w:val="Hyperlink"/>
-          <w:color w:val="auto"/>
-        </w:rPr>
-      </w:pPr>
-      <w:r>
-        <w:rPr>
-          <w:rStyle w:val="Hyperlink"/>
-          <w:color w:val="FFC000"/>
-        </w:rPr>
-        <w:t>{%p else %}</w:t>
-      </w:r>
-    </w:p>
-    <w:p>
-      <w:pPr>
-        <w:pStyle w:val="Body"/>
-        <w:rPr>
-          <w:rStyle w:val="Hyperlink"/>
-          <w:color w:val="auto"/>
-        </w:rPr>
-      </w:pPr>
-      <w:hyperlink r:id="rId13" w:history="1">
-        <w:r>
-          <w:rPr>
-            <w:rStyle w:val="Hyperlink"/>
-          </w:rPr>
-          <w:t>Modifying Child Custody or Child Support Order</w:t>
-        </w:r>
-      </w:hyperlink>
-      <w:r>
-        <w:rPr>
-          <w:rStyle w:val="Hyperlink"/>
-          <w:color w:val="auto"/>
-        </w:rPr>
-        <w:br/>
-      </w:r>
-      <w:hyperlink r:id="rId14" w:history="1">
-        <w:r>
-          <w:rPr>
-            <w:rStyle w:val="Hyperlink"/>
-          </w:rPr>
-          <w:t>ak-courts.info/mtm</w:t>
-        </w:r>
-      </w:hyperlink>
-    </w:p>
-    <w:p>
-      <w:pPr>
-        <w:pStyle w:val="Body"/>
-        <w:rPr>
-          <w:rStyle w:val="Hyperlink"/>
-        </w:rPr>
-      </w:pPr>
-      <w:r>
-        <w:rPr>
-          <w:rStyle w:val="Hyperlink"/>
-          <w:color w:val="FFC000"/>
-        </w:rPr>
-        <w:t>{%p endif %}</w:t>
-      </w:r>
-    </w:p>
-    <w:p>
-      <w:pPr>
-        <w:pStyle w:val="Body"/>
-      </w:pPr>
-      <w:r>
-        <w:rPr>
-          <w:color w:val="FF0000"/>
-        </w:rPr>
-        <w:t xml:space="preserve">{%p </w:t>
-      </w:r>
-      <w:r>
-        <w:rPr>
-          <w:color w:val="FF0000"/>
-        </w:rPr>
-        <w:t>end</w:t>
-      </w:r>
-      <w:r>
-        <w:rPr>
-          <w:color w:val="FF0000"/>
-        </w:rPr>
-        <w:t>if</w:t>
-      </w:r>
-      <w:r>
-        <w:rPr>
-          <w:color w:val="FF0000"/>
-        </w:rPr>
-        <w:t xml:space="preserve"> %}</w:t>
       </w:r>
     </w:p>
     <w:sectPr>
@@ -1400,6 +1529,81 @@
     </w:sectPr>
   </w:body>
 </w:document>
+</file>
+
+<file path=word/comments.xml><?xml version="1.0" encoding="utf-8"?>
+<w:comments xmlns:wpc="http://schemas.microsoft.com/office/word/2010/wordprocessingCanvas" xmlns:cx="http://schemas.microsoft.com/office/drawing/2014/chartex" xmlns:cx1="http://schemas.microsoft.com/office/drawing/2015/9/8/chartex" xmlns:cx2="http://schemas.microsoft.com/office/drawing/2015/10/21/chartex" xmlns:cx3="http://schemas.microsoft.com/office/drawing/2016/5/9/chartex" xmlns:cx4="http://schemas.microsoft.com/office/drawing/2016/5/10/chartex" xmlns:cx5="http://schemas.microsoft.com/office/drawing/2016/5/11/chartex" xmlns:cx6="http://schemas.microsoft.com/office/drawing/2016/5/12/chartex" xmlns:cx7="http://schemas.microsoft.com/office/drawing/2016/5/13/chartex" xmlns:cx8="http://schemas.microsoft.com/office/drawing/2016/5/14/chartex" xmlns:mc="http://schemas.openxmlformats.org/markup-compatibility/2006" xmlns:aink="http://schemas.microsoft.com/office/drawing/2016/ink" xmlns:am3d="http://schemas.microsoft.com/office/drawing/2017/model3d" xmlns:o="urn:schemas-microsoft-com:office:office" xmlns:r="http://schemas.openxmlformats.org/officeDocument/2006/relationships" xmlns:m="http://schemas.openxmlformats.org/officeDocument/2006/math" xmlns:v="urn:schemas-microsoft-com:vml" xmlns:wp14="http://schemas.microsoft.com/office/word/2010/wordprocessingDrawing" xmlns:wp="http://schemas.openxmlformats.org/drawingml/2006/wordprocessingDrawing" xmlns:w10="urn:schemas-microsoft-com:office:word" xmlns:w="http://schemas.openxmlformats.org/wordprocessingml/2006/main" xmlns:w14="http://schemas.microsoft.com/office/word/2010/wordml" xmlns:w15="http://schemas.microsoft.com/office/word/2012/wordml" xmlns:w16cex="http://schemas.microsoft.com/office/word/2018/wordml/cex" xmlns:w16cid="http://schemas.microsoft.com/office/word/2016/wordml/cid" xmlns:w16="http://schemas.microsoft.com/office/word/2018/wordml" xmlns:w16sdtdh="http://schemas.microsoft.com/office/word/2020/wordml/sdtdatahash" xmlns:w16se="http://schemas.microsoft.com/office/word/2015/wordml/symex" xmlns:wpg="http://schemas.microsoft.com/office/word/2010/wordprocessingGroup" xmlns:wpi="http://schemas.microsoft.com/office/word/2010/wordprocessingInk" xmlns:wne="http://schemas.microsoft.com/office/word/2006/wordml" xmlns:wps="http://schemas.microsoft.com/office/word/2010/wordprocessingShape" mc:Ignorable="w14 w15 w16se w16cid w16 w16cex w16sdtdh wp14">
+  <w:comment w:id="0" w:author="Caroline Robinson" w:date="2025-06-18T08:38:00Z" w:initials="CR">
+    <w:p>
+      <w:pPr>
+        <w:pStyle w:val="CommentText"/>
+      </w:pPr>
+      <w:r>
+        <w:rPr>
+          <w:rStyle w:val="CommentReference"/>
+        </w:rPr>
+        <w:annotationRef/>
+      </w:r>
+      <w:r>
+        <w:t>Move to answer step</w:t>
+      </w:r>
+    </w:p>
+  </w:comment>
+  <w:comment w:id="1" w:author="Caroline Robinson" w:date="2025-07-17T15:02:00Z" w:initials="CR">
+    <w:p>
+      <w:pPr>
+        <w:pStyle w:val="CommentText"/>
+      </w:pPr>
+      <w:r>
+        <w:rPr>
+          <w:rStyle w:val="CommentReference"/>
+        </w:rPr>
+        <w:annotationRef/>
+      </w:r>
+      <w:r>
+        <w:t xml:space="preserve">Moved the form details updated the text I think it's updated in html also </w:t>
+      </w:r>
+    </w:p>
+  </w:comment>
+  <w:comment w:id="2" w:author="Caroline Robinson" w:date="2025-06-18T08:39:00Z" w:initials="CR">
+    <w:p>
+      <w:pPr>
+        <w:pStyle w:val="CommentText"/>
+      </w:pPr>
+      <w:r>
+        <w:rPr>
+          <w:rStyle w:val="CommentReference"/>
+        </w:rPr>
+        <w:annotationRef/>
+      </w:r>
+      <w:r>
+        <w:t>Move bak to dismiss step</w:t>
+      </w:r>
+    </w:p>
+  </w:comment>
+</w:comments>
+</file>
+
+<file path=word/commentsExtended.xml><?xml version="1.0" encoding="utf-8"?>
+<w15:commentsEx xmlns:wpc="http://schemas.microsoft.com/office/word/2010/wordprocessingCanvas" xmlns:cx="http://schemas.microsoft.com/office/drawing/2014/chartex" xmlns:cx1="http://schemas.microsoft.com/office/drawing/2015/9/8/chartex" xmlns:cx2="http://schemas.microsoft.com/office/drawing/2015/10/21/chartex" xmlns:cx3="http://schemas.microsoft.com/office/drawing/2016/5/9/chartex" xmlns:cx4="http://schemas.microsoft.com/office/drawing/2016/5/10/chartex" xmlns:cx5="http://schemas.microsoft.com/office/drawing/2016/5/11/chartex" xmlns:cx6="http://schemas.microsoft.com/office/drawing/2016/5/12/chartex" xmlns:cx7="http://schemas.microsoft.com/office/drawing/2016/5/13/chartex" xmlns:cx8="http://schemas.microsoft.com/office/drawing/2016/5/14/chartex" xmlns:mc="http://schemas.openxmlformats.org/markup-compatibility/2006" xmlns:aink="http://schemas.microsoft.com/office/drawing/2016/ink" xmlns:am3d="http://schemas.microsoft.com/office/drawing/2017/model3d" xmlns:o="urn:schemas-microsoft-com:office:office" xmlns:r="http://schemas.openxmlformats.org/officeDocument/2006/relationships" xmlns:m="http://schemas.openxmlformats.org/officeDocument/2006/math" xmlns:v="urn:schemas-microsoft-com:vml" xmlns:wp14="http://schemas.microsoft.com/office/word/2010/wordprocessingDrawing" xmlns:wp="http://schemas.openxmlformats.org/drawingml/2006/wordprocessingDrawing" xmlns:w10="urn:schemas-microsoft-com:office:word" xmlns:w="http://schemas.openxmlformats.org/wordprocessingml/2006/main" xmlns:w14="http://schemas.microsoft.com/office/word/2010/wordml" xmlns:w15="http://schemas.microsoft.com/office/word/2012/wordml" xmlns:w16cex="http://schemas.microsoft.com/office/word/2018/wordml/cex" xmlns:w16cid="http://schemas.microsoft.com/office/word/2016/wordml/cid" xmlns:w16="http://schemas.microsoft.com/office/word/2018/wordml" xmlns:w16sdtdh="http://schemas.microsoft.com/office/word/2020/wordml/sdtdatahash" xmlns:w16se="http://schemas.microsoft.com/office/word/2015/wordml/symex" xmlns:wpg="http://schemas.microsoft.com/office/word/2010/wordprocessingGroup" xmlns:wpi="http://schemas.microsoft.com/office/word/2010/wordprocessingInk" xmlns:wne="http://schemas.microsoft.com/office/word/2006/wordml" xmlns:wps="http://schemas.microsoft.com/office/word/2010/wordprocessingShape" mc:Ignorable="w14 w15 w16se w16cid w16 w16cex w16sdtdh wp14">
+  <w15:commentEx w15:paraId="43307418" w15:done="0"/>
+  <w15:commentEx w15:paraId="34E28241" w15:paraIdParent="43307418" w15:done="0"/>
+  <w15:commentEx w15:paraId="70ABC0AA" w15:done="0"/>
+</w15:commentsEx>
+</file>
+
+<file path=word/commentsExtensible.xml><?xml version="1.0" encoding="utf-8"?>
+<w16cex:commentsExtensible xmlns:wpc="http://schemas.microsoft.com/office/word/2010/wordprocessingCanvas" xmlns:cx="http://schemas.microsoft.com/office/drawing/2014/chartex" xmlns:cx1="http://schemas.microsoft.com/office/drawing/2015/9/8/chartex" xmlns:cx2="http://schemas.microsoft.com/office/drawing/2015/10/21/chartex" xmlns:cx3="http://schemas.microsoft.com/office/drawing/2016/5/9/chartex" xmlns:cx4="http://schemas.microsoft.com/office/drawing/2016/5/10/chartex" xmlns:cx5="http://schemas.microsoft.com/office/drawing/2016/5/11/chartex" xmlns:cx6="http://schemas.microsoft.com/office/drawing/2016/5/12/chartex" xmlns:cx7="http://schemas.microsoft.com/office/drawing/2016/5/13/chartex" xmlns:cx8="http://schemas.microsoft.com/office/drawing/2016/5/14/chartex" xmlns:mc="http://schemas.openxmlformats.org/markup-compatibility/2006" xmlns:aink="http://schemas.microsoft.com/office/drawing/2016/ink" xmlns:am3d="http://schemas.microsoft.com/office/drawing/2017/model3d" xmlns:o="urn:schemas-microsoft-com:office:office" xmlns:r="http://schemas.openxmlformats.org/officeDocument/2006/relationships" xmlns:m="http://schemas.openxmlformats.org/officeDocument/2006/math" xmlns:v="urn:schemas-microsoft-com:vml" xmlns:wp14="http://schemas.microsoft.com/office/word/2010/wordprocessingDrawing" xmlns:wp="http://schemas.openxmlformats.org/drawingml/2006/wordprocessingDrawing" xmlns:w10="urn:schemas-microsoft-com:office:word" xmlns:w="http://schemas.openxmlformats.org/wordprocessingml/2006/main" xmlns:w14="http://schemas.microsoft.com/office/word/2010/wordml" xmlns:w15="http://schemas.microsoft.com/office/word/2012/wordml" xmlns:w16cex="http://schemas.microsoft.com/office/word/2018/wordml/cex" xmlns:w16cid="http://schemas.microsoft.com/office/word/2016/wordml/cid" xmlns:w16="http://schemas.microsoft.com/office/word/2018/wordml" xmlns:w16sdtdh="http://schemas.microsoft.com/office/word/2020/wordml/sdtdatahash" xmlns:w16se="http://schemas.microsoft.com/office/word/2015/wordml/symex" xmlns:wpg="http://schemas.microsoft.com/office/word/2010/wordprocessingGroup" xmlns:wpi="http://schemas.microsoft.com/office/word/2010/wordprocessingInk" xmlns:wne="http://schemas.microsoft.com/office/word/2006/wordml" xmlns:wps="http://schemas.microsoft.com/office/word/2010/wordprocessingShape" mc:Ignorable="w14 w15 w16se w16cid w16 w16cex w16sdtdh wp14">
+  <w16cex:commentExtensible w16cex:durableId="2D838910" w16cex:dateUtc="2025-07-17T23:02:00Z"/>
+</w16cex:commentsExtensible>
+</file>
+
+<file path=word/commentsIds.xml><?xml version="1.0" encoding="utf-8"?>
+<w16cid:commentsIds xmlns:wpc="http://schemas.microsoft.com/office/word/2010/wordprocessingCanvas" xmlns:cx="http://schemas.microsoft.com/office/drawing/2014/chartex" xmlns:cx1="http://schemas.microsoft.com/office/drawing/2015/9/8/chartex" xmlns:cx2="http://schemas.microsoft.com/office/drawing/2015/10/21/chartex" xmlns:cx3="http://schemas.microsoft.com/office/drawing/2016/5/9/chartex" xmlns:cx4="http://schemas.microsoft.com/office/drawing/2016/5/10/chartex" xmlns:cx5="http://schemas.microsoft.com/office/drawing/2016/5/11/chartex" xmlns:cx6="http://schemas.microsoft.com/office/drawing/2016/5/12/chartex" xmlns:cx7="http://schemas.microsoft.com/office/drawing/2016/5/13/chartex" xmlns:cx8="http://schemas.microsoft.com/office/drawing/2016/5/14/chartex" xmlns:mc="http://schemas.openxmlformats.org/markup-compatibility/2006" xmlns:aink="http://schemas.microsoft.com/office/drawing/2016/ink" xmlns:am3d="http://schemas.microsoft.com/office/drawing/2017/model3d" xmlns:o="urn:schemas-microsoft-com:office:office" xmlns:r="http://schemas.openxmlformats.org/officeDocument/2006/relationships" xmlns:m="http://schemas.openxmlformats.org/officeDocument/2006/math" xmlns:v="urn:schemas-microsoft-com:vml" xmlns:wp14="http://schemas.microsoft.com/office/word/2010/wordprocessingDrawing" xmlns:wp="http://schemas.openxmlformats.org/drawingml/2006/wordprocessingDrawing" xmlns:w10="urn:schemas-microsoft-com:office:word" xmlns:w="http://schemas.openxmlformats.org/wordprocessingml/2006/main" xmlns:w14="http://schemas.microsoft.com/office/word/2010/wordml" xmlns:w15="http://schemas.microsoft.com/office/word/2012/wordml" xmlns:w16cex="http://schemas.microsoft.com/office/word/2018/wordml/cex" xmlns:w16cid="http://schemas.microsoft.com/office/word/2016/wordml/cid" xmlns:w16="http://schemas.microsoft.com/office/word/2018/wordml" xmlns:w16sdtdh="http://schemas.microsoft.com/office/word/2020/wordml/sdtdatahash" xmlns:w16se="http://schemas.microsoft.com/office/word/2015/wordml/symex" xmlns:wpg="http://schemas.microsoft.com/office/word/2010/wordprocessingGroup" xmlns:wpi="http://schemas.microsoft.com/office/word/2010/wordprocessingInk" xmlns:wne="http://schemas.microsoft.com/office/word/2006/wordml" xmlns:wps="http://schemas.microsoft.com/office/word/2010/wordprocessingShape" mc:Ignorable="w14 w15 w16se w16cid w16 w16cex w16sdtdh wp14">
+  <w16cid:commentId w16cid:paraId="43307418" w16cid:durableId="2D838911"/>
+  <w16cid:commentId w16cid:paraId="34E28241" w16cid:durableId="2D838910"/>
+  <w16cid:commentId w16cid:paraId="70ABC0AA" w16cid:durableId="2D8389E4"/>
+</w16cid:commentsIds>
 </file>
 
 <file path=word/numbering.xml><?xml version="1.0" encoding="utf-8"?>
@@ -2782,6 +2986,14 @@
   </w:num>
   <w:numIdMacAtCleanup w:val="14"/>
 </w:numbering>
+</file>
+
+<file path=word/people.xml><?xml version="1.0" encoding="utf-8"?>
+<w15:people xmlns:wpc="http://schemas.microsoft.com/office/word/2010/wordprocessingCanvas" xmlns:cx="http://schemas.microsoft.com/office/drawing/2014/chartex" xmlns:cx1="http://schemas.microsoft.com/office/drawing/2015/9/8/chartex" xmlns:cx2="http://schemas.microsoft.com/office/drawing/2015/10/21/chartex" xmlns:cx3="http://schemas.microsoft.com/office/drawing/2016/5/9/chartex" xmlns:cx4="http://schemas.microsoft.com/office/drawing/2016/5/10/chartex" xmlns:cx5="http://schemas.microsoft.com/office/drawing/2016/5/11/chartex" xmlns:cx6="http://schemas.microsoft.com/office/drawing/2016/5/12/chartex" xmlns:cx7="http://schemas.microsoft.com/office/drawing/2016/5/13/chartex" xmlns:cx8="http://schemas.microsoft.com/office/drawing/2016/5/14/chartex" xmlns:mc="http://schemas.openxmlformats.org/markup-compatibility/2006" xmlns:aink="http://schemas.microsoft.com/office/drawing/2016/ink" xmlns:am3d="http://schemas.microsoft.com/office/drawing/2017/model3d" xmlns:o="urn:schemas-microsoft-com:office:office" xmlns:r="http://schemas.openxmlformats.org/officeDocument/2006/relationships" xmlns:m="http://schemas.openxmlformats.org/officeDocument/2006/math" xmlns:v="urn:schemas-microsoft-com:vml" xmlns:wp14="http://schemas.microsoft.com/office/word/2010/wordprocessingDrawing" xmlns:wp="http://schemas.openxmlformats.org/drawingml/2006/wordprocessingDrawing" xmlns:w10="urn:schemas-microsoft-com:office:word" xmlns:w="http://schemas.openxmlformats.org/wordprocessingml/2006/main" xmlns:w14="http://schemas.microsoft.com/office/word/2010/wordml" xmlns:w15="http://schemas.microsoft.com/office/word/2012/wordml" xmlns:w16cex="http://schemas.microsoft.com/office/word/2018/wordml/cex" xmlns:w16cid="http://schemas.microsoft.com/office/word/2016/wordml/cid" xmlns:w16="http://schemas.microsoft.com/office/word/2018/wordml" xmlns:w16sdtdh="http://schemas.microsoft.com/office/word/2020/wordml/sdtdatahash" xmlns:w16se="http://schemas.microsoft.com/office/word/2015/wordml/symex" xmlns:wpg="http://schemas.microsoft.com/office/word/2010/wordprocessingGroup" xmlns:wpi="http://schemas.microsoft.com/office/word/2010/wordprocessingInk" xmlns:wne="http://schemas.microsoft.com/office/word/2006/wordml" xmlns:wps="http://schemas.microsoft.com/office/word/2010/wordprocessingShape" mc:Ignorable="w14 w15 w16se w16cid w16 w16cex w16sdtdh wp14">
+  <w15:person w15:author="Caroline Robinson">
+    <w15:presenceInfo w15:providerId="AD" w15:userId="S::crobinson@akcourts.gov::90d5f6fb-be36-42a5-b1db-9f4aa0bce5fa"/>
+  </w15:person>
+</w15:people>
 </file>
 
 <file path=word/styles.xml><?xml version="1.0" encoding="utf-8"?>

</xml_diff>

<commit_message>
discovered default_options_content.docx had comments - and broke docx to PDF conversion. Just removed comments, still have to update to match mako
</commit_message>
<xml_diff>
--- a/docassemble/AKA2JBranding/data/templates/default_options_content.docx
+++ b/docassemble/AKA2JBranding/data/templates/default_options_content.docx
@@ -376,23 +376,7 @@
         <w:pStyle w:val="Body"/>
       </w:pPr>
       <w:r>
-        <w:t xml:space="preserve">Read about asking the judge to set aside the default judgment in steps {{ </w:t>
-      </w:r>
-      <w:proofErr w:type="spellStart"/>
-      <w:r>
-        <w:t>learn_set_aside_idx</w:t>
-      </w:r>
-      <w:proofErr w:type="spellEnd"/>
-      <w:r>
-        <w:t xml:space="preserve"> }} and {{ </w:t>
-      </w:r>
-      <w:proofErr w:type="spellStart"/>
-      <w:r>
-        <w:t>fill_set_aside_idx</w:t>
-      </w:r>
-      <w:proofErr w:type="spellEnd"/>
-      <w:r>
-        <w:t xml:space="preserve"> }}</w:t>
+        <w:t>Read about asking the judge to set aside the default judgment in steps {{ learn_set_aside_idx }} and {{ fill_set_aside_idx }}</w:t>
       </w:r>
     </w:p>
     <w:p>
@@ -1067,8 +1051,6 @@
           <w:bCs/>
         </w:rPr>
       </w:pPr>
-      <w:commentRangeStart w:id="0"/>
-      <w:commentRangeStart w:id="1"/>
       <w:r>
         <w:rPr>
           <w:color w:val="FFC000"/>
@@ -1130,41 +1112,138 @@
         <w:rPr>
           <w:bCs/>
         </w:rPr>
-        <w:t xml:space="preserve">{ </w:t>
-      </w:r>
-      <w:proofErr w:type="spellStart"/>
+        <w:t>{ answer_step.subject }</w:t>
+      </w:r>
       <w:r>
         <w:rPr>
           <w:bCs/>
         </w:rPr>
-        <w:t>answer_step.subject</w:t>
-      </w:r>
-      <w:proofErr w:type="spellEnd"/>
+        <w:t>}</w:t>
+      </w:r>
       <w:r>
         <w:rPr>
           <w:bCs/>
         </w:rPr>
-        <w:t xml:space="preserve"> }</w:t>
-      </w:r>
-      <w:r>
+        <w:t>.</w:t>
+      </w:r>
+    </w:p>
+    <w:p>
+      <w:pPr>
+        <w:pStyle w:val="Body"/>
+        <w:rPr>
+          <w:color w:val="FFC000"/>
+        </w:rPr>
+      </w:pPr>
+      <w:r>
+        <w:rPr>
+          <w:color w:val="FFC000"/>
+        </w:rPr>
+        <w:t>{%</w:t>
+      </w:r>
+      <w:r>
+        <w:rPr>
+          <w:color w:val="FFC000"/>
+        </w:rPr>
+        <w:t>p</w:t>
+      </w:r>
+      <w:r>
+        <w:rPr>
+          <w:color w:val="FFC000"/>
+        </w:rPr>
+        <w:t xml:space="preserve"> endif %}</w:t>
+      </w:r>
+    </w:p>
+    <w:p>
+      <w:pPr>
+        <w:pStyle w:val="Body"/>
         <w:rPr>
           <w:bCs/>
         </w:rPr>
-        <w:t>}</w:t>
+      </w:pPr>
+      <w:r>
+        <w:rPr>
+          <w:color w:val="FFC000"/>
+        </w:rPr>
+        <w:t>{%</w:t>
+      </w:r>
+      <w:r>
+        <w:rPr>
+          <w:color w:val="FFC000"/>
+        </w:rPr>
+        <w:t>p</w:t>
+      </w:r>
+      <w:r>
+        <w:rPr>
+          <w:color w:val="FFC000"/>
+        </w:rPr>
+        <w:t xml:space="preserve"> if stage_of_default == 'hearing scheduled' %}</w:t>
+      </w:r>
+      <w:r>
+        <w:t xml:space="preserve">Because the clerk signed the entry of default, you will have to ask the judge to accept your Answer even though it is late. </w:t>
       </w:r>
       <w:r>
         <w:rPr>
           <w:bCs/>
         </w:rPr>
+        <w:t xml:space="preserve">See Step </w:t>
+      </w:r>
+      <w:r>
+        <w:rPr>
+          <w:bCs/>
+        </w:rPr>
+        <w:fldChar w:fldCharType="begin"/>
+      </w:r>
+      <w:r>
+        <w:rPr>
+          <w:bCs/>
+        </w:rPr>
+        <w:instrText xml:space="preserve"> REF Answer \h </w:instrText>
+      </w:r>
+      <w:r>
+        <w:rPr>
+          <w:bCs/>
+        </w:rPr>
+      </w:r>
+      <w:r>
+        <w:rPr>
+          <w:bCs/>
+        </w:rPr>
+        <w:fldChar w:fldCharType="separate"/>
+      </w:r>
+      <w:r>
+        <w:rPr>
+          <w:noProof/>
+        </w:rPr>
+        <w:t>8</w:t>
+      </w:r>
+      <w:r>
+        <w:rPr>
+          <w:bCs/>
+        </w:rPr>
+        <w:fldChar w:fldCharType="end"/>
+      </w:r>
+      <w:r>
+        <w:rPr>
+          <w:bCs/>
+        </w:rPr>
+        <w:t xml:space="preserve">: </w:t>
+      </w:r>
+      <w:r>
+        <w:rPr>
+          <w:bCs/>
+        </w:rPr>
+        <w:t>Fill out the forms to respond</w:t>
+      </w:r>
+      <w:r>
+        <w:rPr>
+          <w:bCs/>
+        </w:rPr>
         <w:t>.</w:t>
       </w:r>
     </w:p>
     <w:p>
       <w:pPr>
         <w:pStyle w:val="Body"/>
-        <w:rPr>
-          <w:color w:val="FFC000"/>
-        </w:rPr>
       </w:pPr>
       <w:r>
         <w:rPr>
@@ -1183,133 +1262,6 @@
           <w:color w:val="FFC000"/>
         </w:rPr>
         <w:t xml:space="preserve"> endif %}</w:t>
-      </w:r>
-    </w:p>
-    <w:p>
-      <w:pPr>
-        <w:pStyle w:val="Body"/>
-        <w:rPr>
-          <w:bCs/>
-        </w:rPr>
-      </w:pPr>
-      <w:r>
-        <w:rPr>
-          <w:color w:val="FFC000"/>
-        </w:rPr>
-        <w:t>{%</w:t>
-      </w:r>
-      <w:r>
-        <w:rPr>
-          <w:color w:val="FFC000"/>
-        </w:rPr>
-        <w:t>p</w:t>
-      </w:r>
-      <w:r>
-        <w:rPr>
-          <w:color w:val="FFC000"/>
-        </w:rPr>
-        <w:t xml:space="preserve"> if stage_of_default == 'hearing scheduled' %}</w:t>
-      </w:r>
-      <w:r>
-        <w:t xml:space="preserve">Because the clerk signed the entry of default, you will have to ask the judge to accept your Answer even though it is late. </w:t>
-      </w:r>
-      <w:r>
-        <w:rPr>
-          <w:bCs/>
-        </w:rPr>
-        <w:t xml:space="preserve">See Step </w:t>
-      </w:r>
-      <w:r>
-        <w:rPr>
-          <w:bCs/>
-        </w:rPr>
-        <w:fldChar w:fldCharType="begin"/>
-      </w:r>
-      <w:r>
-        <w:rPr>
-          <w:bCs/>
-        </w:rPr>
-        <w:instrText xml:space="preserve"> REF Answer \h </w:instrText>
-      </w:r>
-      <w:r>
-        <w:rPr>
-          <w:bCs/>
-        </w:rPr>
-      </w:r>
-      <w:r>
-        <w:rPr>
-          <w:bCs/>
-        </w:rPr>
-        <w:fldChar w:fldCharType="separate"/>
-      </w:r>
-      <w:r>
-        <w:rPr>
-          <w:noProof/>
-        </w:rPr>
-        <w:t>8</w:t>
-      </w:r>
-      <w:r>
-        <w:rPr>
-          <w:bCs/>
-        </w:rPr>
-        <w:fldChar w:fldCharType="end"/>
-      </w:r>
-      <w:r>
-        <w:rPr>
-          <w:bCs/>
-        </w:rPr>
-        <w:t xml:space="preserve">: </w:t>
-      </w:r>
-      <w:r>
-        <w:rPr>
-          <w:bCs/>
-        </w:rPr>
-        <w:t>Fill out the forms to respond</w:t>
-      </w:r>
-      <w:r>
-        <w:rPr>
-          <w:bCs/>
-        </w:rPr>
-        <w:t>.</w:t>
-      </w:r>
-    </w:p>
-    <w:p>
-      <w:pPr>
-        <w:pStyle w:val="Body"/>
-      </w:pPr>
-      <w:r>
-        <w:rPr>
-          <w:color w:val="FFC000"/>
-        </w:rPr>
-        <w:t>{%</w:t>
-      </w:r>
-      <w:r>
-        <w:rPr>
-          <w:color w:val="FFC000"/>
-        </w:rPr>
-        <w:t>p</w:t>
-      </w:r>
-      <w:r>
-        <w:rPr>
-          <w:color w:val="FFC000"/>
-        </w:rPr>
-        <w:t xml:space="preserve"> endif %}</w:t>
-      </w:r>
-      <w:commentRangeEnd w:id="0"/>
-      <w:r>
-        <w:rPr>
-          <w:rStyle w:val="CommentReference"/>
-          <w:rFonts w:ascii="Arial" w:eastAsia="Arial" w:hAnsi="Arial" w:cs="Arial"/>
-        </w:rPr>
-        <w:commentReference w:id="0"/>
-      </w:r>
-      <w:commentRangeEnd w:id="1"/>
-      <w:r>
-        <w:rPr>
-          <w:rStyle w:val="CommentReference"/>
-          <w:rFonts w:ascii="Arial" w:eastAsia="Arial" w:hAnsi="Arial" w:cs="Arial"/>
-        </w:rPr>
-        <w:commentReference w:id="1"/>
       </w:r>
     </w:p>
     <w:p>
@@ -1384,15 +1336,6 @@
       <w:pPr>
         <w:pStyle w:val="Body"/>
       </w:pPr>
-      <w:commentRangeStart w:id="2"/>
-      <w:commentRangeEnd w:id="2"/>
-      <w:r>
-        <w:rPr>
-          <w:rStyle w:val="CommentReference"/>
-          <w:rFonts w:ascii="Arial" w:eastAsia="Arial" w:hAnsi="Arial" w:cs="Arial"/>
-        </w:rPr>
-        <w:commentReference w:id="2"/>
-      </w:r>
       <w:r>
         <w:t xml:space="preserve">If </w:t>
       </w:r>
@@ -1529,81 +1472,6 @@
     </w:sectPr>
   </w:body>
 </w:document>
-</file>
-
-<file path=word/comments.xml><?xml version="1.0" encoding="utf-8"?>
-<w:comments xmlns:wpc="http://schemas.microsoft.com/office/word/2010/wordprocessingCanvas" xmlns:cx="http://schemas.microsoft.com/office/drawing/2014/chartex" xmlns:cx1="http://schemas.microsoft.com/office/drawing/2015/9/8/chartex" xmlns:cx2="http://schemas.microsoft.com/office/drawing/2015/10/21/chartex" xmlns:cx3="http://schemas.microsoft.com/office/drawing/2016/5/9/chartex" xmlns:cx4="http://schemas.microsoft.com/office/drawing/2016/5/10/chartex" xmlns:cx5="http://schemas.microsoft.com/office/drawing/2016/5/11/chartex" xmlns:cx6="http://schemas.microsoft.com/office/drawing/2016/5/12/chartex" xmlns:cx7="http://schemas.microsoft.com/office/drawing/2016/5/13/chartex" xmlns:cx8="http://schemas.microsoft.com/office/drawing/2016/5/14/chartex" xmlns:mc="http://schemas.openxmlformats.org/markup-compatibility/2006" xmlns:aink="http://schemas.microsoft.com/office/drawing/2016/ink" xmlns:am3d="http://schemas.microsoft.com/office/drawing/2017/model3d" xmlns:o="urn:schemas-microsoft-com:office:office" xmlns:r="http://schemas.openxmlformats.org/officeDocument/2006/relationships" xmlns:m="http://schemas.openxmlformats.org/officeDocument/2006/math" xmlns:v="urn:schemas-microsoft-com:vml" xmlns:wp14="http://schemas.microsoft.com/office/word/2010/wordprocessingDrawing" xmlns:wp="http://schemas.openxmlformats.org/drawingml/2006/wordprocessingDrawing" xmlns:w10="urn:schemas-microsoft-com:office:word" xmlns:w="http://schemas.openxmlformats.org/wordprocessingml/2006/main" xmlns:w14="http://schemas.microsoft.com/office/word/2010/wordml" xmlns:w15="http://schemas.microsoft.com/office/word/2012/wordml" xmlns:w16cex="http://schemas.microsoft.com/office/word/2018/wordml/cex" xmlns:w16cid="http://schemas.microsoft.com/office/word/2016/wordml/cid" xmlns:w16="http://schemas.microsoft.com/office/word/2018/wordml" xmlns:w16sdtdh="http://schemas.microsoft.com/office/word/2020/wordml/sdtdatahash" xmlns:w16se="http://schemas.microsoft.com/office/word/2015/wordml/symex" xmlns:wpg="http://schemas.microsoft.com/office/word/2010/wordprocessingGroup" xmlns:wpi="http://schemas.microsoft.com/office/word/2010/wordprocessingInk" xmlns:wne="http://schemas.microsoft.com/office/word/2006/wordml" xmlns:wps="http://schemas.microsoft.com/office/word/2010/wordprocessingShape" mc:Ignorable="w14 w15 w16se w16cid w16 w16cex w16sdtdh wp14">
-  <w:comment w:id="0" w:author="Caroline Robinson" w:date="2025-06-18T08:38:00Z" w:initials="CR">
-    <w:p>
-      <w:pPr>
-        <w:pStyle w:val="CommentText"/>
-      </w:pPr>
-      <w:r>
-        <w:rPr>
-          <w:rStyle w:val="CommentReference"/>
-        </w:rPr>
-        <w:annotationRef/>
-      </w:r>
-      <w:r>
-        <w:t>Move to answer step</w:t>
-      </w:r>
-    </w:p>
-  </w:comment>
-  <w:comment w:id="1" w:author="Caroline Robinson" w:date="2025-07-17T15:02:00Z" w:initials="CR">
-    <w:p>
-      <w:pPr>
-        <w:pStyle w:val="CommentText"/>
-      </w:pPr>
-      <w:r>
-        <w:rPr>
-          <w:rStyle w:val="CommentReference"/>
-        </w:rPr>
-        <w:annotationRef/>
-      </w:r>
-      <w:r>
-        <w:t xml:space="preserve">Moved the form details updated the text I think it's updated in html also </w:t>
-      </w:r>
-    </w:p>
-  </w:comment>
-  <w:comment w:id="2" w:author="Caroline Robinson" w:date="2025-06-18T08:39:00Z" w:initials="CR">
-    <w:p>
-      <w:pPr>
-        <w:pStyle w:val="CommentText"/>
-      </w:pPr>
-      <w:r>
-        <w:rPr>
-          <w:rStyle w:val="CommentReference"/>
-        </w:rPr>
-        <w:annotationRef/>
-      </w:r>
-      <w:r>
-        <w:t>Move bak to dismiss step</w:t>
-      </w:r>
-    </w:p>
-  </w:comment>
-</w:comments>
-</file>
-
-<file path=word/commentsExtended.xml><?xml version="1.0" encoding="utf-8"?>
-<w15:commentsEx xmlns:wpc="http://schemas.microsoft.com/office/word/2010/wordprocessingCanvas" xmlns:cx="http://schemas.microsoft.com/office/drawing/2014/chartex" xmlns:cx1="http://schemas.microsoft.com/office/drawing/2015/9/8/chartex" xmlns:cx2="http://schemas.microsoft.com/office/drawing/2015/10/21/chartex" xmlns:cx3="http://schemas.microsoft.com/office/drawing/2016/5/9/chartex" xmlns:cx4="http://schemas.microsoft.com/office/drawing/2016/5/10/chartex" xmlns:cx5="http://schemas.microsoft.com/office/drawing/2016/5/11/chartex" xmlns:cx6="http://schemas.microsoft.com/office/drawing/2016/5/12/chartex" xmlns:cx7="http://schemas.microsoft.com/office/drawing/2016/5/13/chartex" xmlns:cx8="http://schemas.microsoft.com/office/drawing/2016/5/14/chartex" xmlns:mc="http://schemas.openxmlformats.org/markup-compatibility/2006" xmlns:aink="http://schemas.microsoft.com/office/drawing/2016/ink" xmlns:am3d="http://schemas.microsoft.com/office/drawing/2017/model3d" xmlns:o="urn:schemas-microsoft-com:office:office" xmlns:r="http://schemas.openxmlformats.org/officeDocument/2006/relationships" xmlns:m="http://schemas.openxmlformats.org/officeDocument/2006/math" xmlns:v="urn:schemas-microsoft-com:vml" xmlns:wp14="http://schemas.microsoft.com/office/word/2010/wordprocessingDrawing" xmlns:wp="http://schemas.openxmlformats.org/drawingml/2006/wordprocessingDrawing" xmlns:w10="urn:schemas-microsoft-com:office:word" xmlns:w="http://schemas.openxmlformats.org/wordprocessingml/2006/main" xmlns:w14="http://schemas.microsoft.com/office/word/2010/wordml" xmlns:w15="http://schemas.microsoft.com/office/word/2012/wordml" xmlns:w16cex="http://schemas.microsoft.com/office/word/2018/wordml/cex" xmlns:w16cid="http://schemas.microsoft.com/office/word/2016/wordml/cid" xmlns:w16="http://schemas.microsoft.com/office/word/2018/wordml" xmlns:w16sdtdh="http://schemas.microsoft.com/office/word/2020/wordml/sdtdatahash" xmlns:w16se="http://schemas.microsoft.com/office/word/2015/wordml/symex" xmlns:wpg="http://schemas.microsoft.com/office/word/2010/wordprocessingGroup" xmlns:wpi="http://schemas.microsoft.com/office/word/2010/wordprocessingInk" xmlns:wne="http://schemas.microsoft.com/office/word/2006/wordml" xmlns:wps="http://schemas.microsoft.com/office/word/2010/wordprocessingShape" mc:Ignorable="w14 w15 w16se w16cid w16 w16cex w16sdtdh wp14">
-  <w15:commentEx w15:paraId="43307418" w15:done="0"/>
-  <w15:commentEx w15:paraId="34E28241" w15:paraIdParent="43307418" w15:done="0"/>
-  <w15:commentEx w15:paraId="70ABC0AA" w15:done="0"/>
-</w15:commentsEx>
-</file>
-
-<file path=word/commentsExtensible.xml><?xml version="1.0" encoding="utf-8"?>
-<w16cex:commentsExtensible xmlns:wpc="http://schemas.microsoft.com/office/word/2010/wordprocessingCanvas" xmlns:cx="http://schemas.microsoft.com/office/drawing/2014/chartex" xmlns:cx1="http://schemas.microsoft.com/office/drawing/2015/9/8/chartex" xmlns:cx2="http://schemas.microsoft.com/office/drawing/2015/10/21/chartex" xmlns:cx3="http://schemas.microsoft.com/office/drawing/2016/5/9/chartex" xmlns:cx4="http://schemas.microsoft.com/office/drawing/2016/5/10/chartex" xmlns:cx5="http://schemas.microsoft.com/office/drawing/2016/5/11/chartex" xmlns:cx6="http://schemas.microsoft.com/office/drawing/2016/5/12/chartex" xmlns:cx7="http://schemas.microsoft.com/office/drawing/2016/5/13/chartex" xmlns:cx8="http://schemas.microsoft.com/office/drawing/2016/5/14/chartex" xmlns:mc="http://schemas.openxmlformats.org/markup-compatibility/2006" xmlns:aink="http://schemas.microsoft.com/office/drawing/2016/ink" xmlns:am3d="http://schemas.microsoft.com/office/drawing/2017/model3d" xmlns:o="urn:schemas-microsoft-com:office:office" xmlns:r="http://schemas.openxmlformats.org/officeDocument/2006/relationships" xmlns:m="http://schemas.openxmlformats.org/officeDocument/2006/math" xmlns:v="urn:schemas-microsoft-com:vml" xmlns:wp14="http://schemas.microsoft.com/office/word/2010/wordprocessingDrawing" xmlns:wp="http://schemas.openxmlformats.org/drawingml/2006/wordprocessingDrawing" xmlns:w10="urn:schemas-microsoft-com:office:word" xmlns:w="http://schemas.openxmlformats.org/wordprocessingml/2006/main" xmlns:w14="http://schemas.microsoft.com/office/word/2010/wordml" xmlns:w15="http://schemas.microsoft.com/office/word/2012/wordml" xmlns:w16cex="http://schemas.microsoft.com/office/word/2018/wordml/cex" xmlns:w16cid="http://schemas.microsoft.com/office/word/2016/wordml/cid" xmlns:w16="http://schemas.microsoft.com/office/word/2018/wordml" xmlns:w16sdtdh="http://schemas.microsoft.com/office/word/2020/wordml/sdtdatahash" xmlns:w16se="http://schemas.microsoft.com/office/word/2015/wordml/symex" xmlns:wpg="http://schemas.microsoft.com/office/word/2010/wordprocessingGroup" xmlns:wpi="http://schemas.microsoft.com/office/word/2010/wordprocessingInk" xmlns:wne="http://schemas.microsoft.com/office/word/2006/wordml" xmlns:wps="http://schemas.microsoft.com/office/word/2010/wordprocessingShape" mc:Ignorable="w14 w15 w16se w16cid w16 w16cex w16sdtdh wp14">
-  <w16cex:commentExtensible w16cex:durableId="2D838910" w16cex:dateUtc="2025-07-17T23:02:00Z"/>
-</w16cex:commentsExtensible>
-</file>
-
-<file path=word/commentsIds.xml><?xml version="1.0" encoding="utf-8"?>
-<w16cid:commentsIds xmlns:wpc="http://schemas.microsoft.com/office/word/2010/wordprocessingCanvas" xmlns:cx="http://schemas.microsoft.com/office/drawing/2014/chartex" xmlns:cx1="http://schemas.microsoft.com/office/drawing/2015/9/8/chartex" xmlns:cx2="http://schemas.microsoft.com/office/drawing/2015/10/21/chartex" xmlns:cx3="http://schemas.microsoft.com/office/drawing/2016/5/9/chartex" xmlns:cx4="http://schemas.microsoft.com/office/drawing/2016/5/10/chartex" xmlns:cx5="http://schemas.microsoft.com/office/drawing/2016/5/11/chartex" xmlns:cx6="http://schemas.microsoft.com/office/drawing/2016/5/12/chartex" xmlns:cx7="http://schemas.microsoft.com/office/drawing/2016/5/13/chartex" xmlns:cx8="http://schemas.microsoft.com/office/drawing/2016/5/14/chartex" xmlns:mc="http://schemas.openxmlformats.org/markup-compatibility/2006" xmlns:aink="http://schemas.microsoft.com/office/drawing/2016/ink" xmlns:am3d="http://schemas.microsoft.com/office/drawing/2017/model3d" xmlns:o="urn:schemas-microsoft-com:office:office" xmlns:r="http://schemas.openxmlformats.org/officeDocument/2006/relationships" xmlns:m="http://schemas.openxmlformats.org/officeDocument/2006/math" xmlns:v="urn:schemas-microsoft-com:vml" xmlns:wp14="http://schemas.microsoft.com/office/word/2010/wordprocessingDrawing" xmlns:wp="http://schemas.openxmlformats.org/drawingml/2006/wordprocessingDrawing" xmlns:w10="urn:schemas-microsoft-com:office:word" xmlns:w="http://schemas.openxmlformats.org/wordprocessingml/2006/main" xmlns:w14="http://schemas.microsoft.com/office/word/2010/wordml" xmlns:w15="http://schemas.microsoft.com/office/word/2012/wordml" xmlns:w16cex="http://schemas.microsoft.com/office/word/2018/wordml/cex" xmlns:w16cid="http://schemas.microsoft.com/office/word/2016/wordml/cid" xmlns:w16="http://schemas.microsoft.com/office/word/2018/wordml" xmlns:w16sdtdh="http://schemas.microsoft.com/office/word/2020/wordml/sdtdatahash" xmlns:w16se="http://schemas.microsoft.com/office/word/2015/wordml/symex" xmlns:wpg="http://schemas.microsoft.com/office/word/2010/wordprocessingGroup" xmlns:wpi="http://schemas.microsoft.com/office/word/2010/wordprocessingInk" xmlns:wne="http://schemas.microsoft.com/office/word/2006/wordml" xmlns:wps="http://schemas.microsoft.com/office/word/2010/wordprocessingShape" mc:Ignorable="w14 w15 w16se w16cid w16 w16cex w16sdtdh wp14">
-  <w16cid:commentId w16cid:paraId="43307418" w16cid:durableId="2D838911"/>
-  <w16cid:commentId w16cid:paraId="34E28241" w16cid:durableId="2D838910"/>
-  <w16cid:commentId w16cid:paraId="70ABC0AA" w16cid:durableId="2D8389E4"/>
-</w16cid:commentsIds>
 </file>
 
 <file path=word/numbering.xml><?xml version="1.0" encoding="utf-8"?>
@@ -2986,14 +2854,6 @@
   </w:num>
   <w:numIdMacAtCleanup w:val="14"/>
 </w:numbering>
-</file>
-
-<file path=word/people.xml><?xml version="1.0" encoding="utf-8"?>
-<w15:people xmlns:wpc="http://schemas.microsoft.com/office/word/2010/wordprocessingCanvas" xmlns:cx="http://schemas.microsoft.com/office/drawing/2014/chartex" xmlns:cx1="http://schemas.microsoft.com/office/drawing/2015/9/8/chartex" xmlns:cx2="http://schemas.microsoft.com/office/drawing/2015/10/21/chartex" xmlns:cx3="http://schemas.microsoft.com/office/drawing/2016/5/9/chartex" xmlns:cx4="http://schemas.microsoft.com/office/drawing/2016/5/10/chartex" xmlns:cx5="http://schemas.microsoft.com/office/drawing/2016/5/11/chartex" xmlns:cx6="http://schemas.microsoft.com/office/drawing/2016/5/12/chartex" xmlns:cx7="http://schemas.microsoft.com/office/drawing/2016/5/13/chartex" xmlns:cx8="http://schemas.microsoft.com/office/drawing/2016/5/14/chartex" xmlns:mc="http://schemas.openxmlformats.org/markup-compatibility/2006" xmlns:aink="http://schemas.microsoft.com/office/drawing/2016/ink" xmlns:am3d="http://schemas.microsoft.com/office/drawing/2017/model3d" xmlns:o="urn:schemas-microsoft-com:office:office" xmlns:r="http://schemas.openxmlformats.org/officeDocument/2006/relationships" xmlns:m="http://schemas.openxmlformats.org/officeDocument/2006/math" xmlns:v="urn:schemas-microsoft-com:vml" xmlns:wp14="http://schemas.microsoft.com/office/word/2010/wordprocessingDrawing" xmlns:wp="http://schemas.openxmlformats.org/drawingml/2006/wordprocessingDrawing" xmlns:w10="urn:schemas-microsoft-com:office:word" xmlns:w="http://schemas.openxmlformats.org/wordprocessingml/2006/main" xmlns:w14="http://schemas.microsoft.com/office/word/2010/wordml" xmlns:w15="http://schemas.microsoft.com/office/word/2012/wordml" xmlns:w16cex="http://schemas.microsoft.com/office/word/2018/wordml/cex" xmlns:w16cid="http://schemas.microsoft.com/office/word/2016/wordml/cid" xmlns:w16="http://schemas.microsoft.com/office/word/2018/wordml" xmlns:w16sdtdh="http://schemas.microsoft.com/office/word/2020/wordml/sdtdatahash" xmlns:w16se="http://schemas.microsoft.com/office/word/2015/wordml/symex" xmlns:wpg="http://schemas.microsoft.com/office/word/2010/wordprocessingGroup" xmlns:wpi="http://schemas.microsoft.com/office/word/2010/wordprocessingInk" xmlns:wne="http://schemas.microsoft.com/office/word/2006/wordml" xmlns:wps="http://schemas.microsoft.com/office/word/2010/wordprocessingShape" mc:Ignorable="w14 w15 w16se w16cid w16 w16cex w16sdtdh wp14">
-  <w15:person w15:author="Caroline Robinson">
-    <w15:presenceInfo w15:providerId="AD" w15:userId="S::crobinson@akcourts.gov::90d5f6fb-be36-42a5-b1db-9f4aa0bce5fa"/>
-  </w15:person>
-</w15:people>
 </file>
 
 <file path=word/styles.xml><?xml version="1.0" encoding="utf-8"?>

</xml_diff>

<commit_message>
improved default_options_content.docx - still need to fix heading in mako template
</commit_message>
<xml_diff>
--- a/docassemble/AKA2JBranding/data/templates/default_options_content.docx
+++ b/docassemble/AKA2JBranding/data/templates/default_options_content.docx
@@ -120,13 +120,10 @@
         <w:t xml:space="preserve">It can be complicated to have </w:t>
       </w:r>
       <w:r>
-        <w:rPr>
-          <w:color w:val="00B050"/>
-        </w:rPr>
-        <w:t>{{ “custody” if user_need == ‘answer custody’ else “court” }}</w:t>
-      </w:r>
-      <w:r>
-        <w:t xml:space="preserve"> orders from 2 different state courts</w:t>
+        <w:t xml:space="preserve">{{ “custody” if user_need == ‘answer custody’ else “court” }} </w:t>
+      </w:r>
+      <w:r>
+        <w:t>orders from 2 different state courts</w:t>
       </w:r>
       <w:r>
         <w:t xml:space="preserve">. </w:t>
@@ -226,16 +223,7 @@
         <w:t xml:space="preserve">f you </w:t>
       </w:r>
       <w:r>
-        <w:rPr>
-          <w:color w:val="00B050"/>
-        </w:rPr>
-        <w:t>{{</w:t>
-      </w:r>
-      <w:r>
-        <w:rPr>
-          <w:color w:val="00B050"/>
-        </w:rPr>
-        <w:t xml:space="preserve"> “decide” if proper_service else “want” }}</w:t>
+        <w:t>{{ “decide” if proper_service else “want” }}</w:t>
       </w:r>
       <w:r>
         <w:t xml:space="preserve"> to ask the judge to set aside the default judgment,</w:t>
@@ -400,11 +388,14 @@
         <w:pStyle w:val="Body"/>
       </w:pPr>
       <w:r>
-        <w:t xml:space="preserve">Read about asking the judge to set aside the default judgment in steps {{ </w:t>
+        <w:t xml:space="preserve">Read about asking the judge to set aside the default judgment in {{ </w:t>
       </w:r>
       <w:proofErr w:type="spellStart"/>
       <w:r>
-        <w:t>learn_set_aside_idx</w:t>
+        <w:t>learn_set_aside_</w:t>
+      </w:r>
+      <w:r>
+        <w:t>step.subject</w:t>
       </w:r>
       <w:proofErr w:type="spellEnd"/>
       <w:r>
@@ -412,7 +403,10 @@
       </w:r>
       <w:proofErr w:type="spellStart"/>
       <w:r>
-        <w:t>fill_set_aside_idx</w:t>
+        <w:t>fill_set_aside_</w:t>
+      </w:r>
+      <w:r>
+        <w:t>step.subject</w:t>
       </w:r>
       <w:proofErr w:type="spellEnd"/>
       <w:r>
@@ -440,6 +434,9 @@
       </w:r>
     </w:p>
     <w:p>
+      <w:pPr>
+        <w:pStyle w:val="Body"/>
+      </w:pPr>
       <w:r>
         <w:rPr>
           <w:color w:val="FFC000"/>
@@ -465,33 +462,18 @@
         <w:t>not (</w:t>
       </w:r>
       <w:r>
-        <w:rPr>
-          <w:color w:val="92D050"/>
-        </w:rPr>
         <w:t xml:space="preserve">type_of_response['case in 2 states'] and </w:t>
       </w:r>
       <w:r>
-        <w:rPr>
-          <w:color w:val="92D050"/>
-        </w:rPr>
         <w:t>stage_of_other_case</w:t>
       </w:r>
       <w:r>
-        <w:rPr>
-          <w:color w:val="92D050"/>
-        </w:rPr>
         <w:t xml:space="preserve">== </w:t>
       </w:r>
       <w:r>
-        <w:rPr>
-          <w:color w:val="92D050"/>
-        </w:rPr>
         <w:t>'</w:t>
       </w:r>
       <w:r>
-        <w:rPr>
-          <w:color w:val="92D050"/>
-        </w:rPr>
         <w:t>ended with order'</w:t>
       </w:r>
       <w:r>
@@ -508,11 +490,17 @@
       </w:r>
     </w:p>
     <w:p>
+      <w:pPr>
+        <w:pStyle w:val="Body"/>
+      </w:pPr>
       <w:r>
         <w:t>If you are okay with the judge’s orders you do not need to do anything.</w:t>
       </w:r>
     </w:p>
     <w:p>
+      <w:pPr>
+        <w:pStyle w:val="Body"/>
+      </w:pPr>
       <w:r>
         <w:rPr>
           <w:color w:val="FFC000"/>
@@ -527,6 +515,9 @@
       </w:r>
     </w:p>
     <w:p>
+      <w:pPr>
+        <w:pStyle w:val="Body"/>
+      </w:pPr>
       <w:r>
         <w:t xml:space="preserve">Be sure you know exactly what the judge ordered. Read about </w:t>
       </w:r>
@@ -543,6 +534,9 @@
       </w:r>
     </w:p>
     <w:p>
+      <w:pPr>
+        <w:pStyle w:val="Body"/>
+      </w:pPr>
       <w:r>
         <w:rPr>
           <w:color w:val="FFC000"/>
@@ -581,6 +575,9 @@
       </w:r>
     </w:p>
     <w:p>
+      <w:pPr>
+        <w:pStyle w:val="Body"/>
+      </w:pPr>
       <w:r>
         <w:t xml:space="preserve">If the Alaska order is different from the </w:t>
       </w:r>
@@ -601,6 +598,9 @@
       </w:r>
     </w:p>
     <w:p>
+      <w:pPr>
+        <w:pStyle w:val="Body"/>
+      </w:pPr>
       <w:r>
         <w:rPr>
           <w:rStyle w:val="BodyChar"/>
@@ -616,6 +616,9 @@
       </w:r>
     </w:p>
     <w:p>
+      <w:pPr>
+        <w:pStyle w:val="Body"/>
+      </w:pPr>
       <w:r>
         <w:t>You should decide quickly. The longer you wait, the harder it is to set aside the court’s order.</w:t>
       </w:r>
@@ -648,7 +651,6 @@
         <w:pStyle w:val="Body"/>
       </w:pPr>
       <w:r>
-        <w:lastRenderedPageBreak/>
         <w:t xml:space="preserve">You may want to </w:t>
       </w:r>
       <w:hyperlink r:id="rId6" w:history="1">
@@ -685,6 +687,7 @@
         <w:rPr>
           <w:color w:val="92D050"/>
         </w:rPr>
+        <w:lastRenderedPageBreak/>
         <w:t>{% if user_need == 'answer custody' or (user_need == 'answer divorce' and minor_children) %}</w:t>
       </w:r>
       <w:r>
@@ -1052,7 +1055,16 @@
         <w:t>{{</w:t>
       </w:r>
       <w:r>
-        <w:t>' and get a custody, Parenting Plan, and child support order.' if minor_children or wife_is_pregnant in('husband', 'not husband') else '.' }</w:t>
+        <w:t xml:space="preserve"> </w:t>
+      </w:r>
+      <w:r>
+        <w:t xml:space="preserve">' and get a custody, Parenting Plan, and child support order.' if minor_children or wife_is_pregnant in('husband', 'not husband') else '.' </w:t>
+      </w:r>
+      <w:r>
+        <w:t>}</w:t>
+      </w:r>
+      <w:r>
+        <w:t>}</w:t>
       </w:r>
       <w:r>
         <w:rPr>
@@ -1245,47 +1257,47 @@
         <w:pStyle w:val="Heading3"/>
       </w:pPr>
       <w:r>
+        <w:t>Option</w:t>
+      </w:r>
+      <w:r>
+        <w:t xml:space="preserve"> </w:t>
+      </w:r>
+      <w:r>
+        <w:t>2</w:t>
+      </w:r>
+      <w:r>
+        <w:t>. Do nothing</w:t>
+      </w:r>
+    </w:p>
+    <w:p>
+      <w:pPr>
+        <w:pStyle w:val="Body"/>
+      </w:pPr>
+      <w:r>
+        <w:rPr>
+          <w:color w:val="FFC000"/>
+        </w:rPr>
+        <w:t>{%</w:t>
+      </w:r>
+      <w:r>
+        <w:rPr>
+          <w:color w:val="FFC000"/>
+        </w:rPr>
+        <w:t>p</w:t>
+      </w:r>
+      <w:r>
+        <w:rPr>
+          <w:color w:val="FFC000"/>
+        </w:rPr>
+        <w:t xml:space="preserve"> endif %}</w:t>
+      </w:r>
+    </w:p>
+    <w:p>
+      <w:pPr>
+        <w:pStyle w:val="Body"/>
+      </w:pPr>
+      <w:r>
         <w:lastRenderedPageBreak/>
-        <w:t>Option</w:t>
-      </w:r>
-      <w:r>
-        <w:t xml:space="preserve"> </w:t>
-      </w:r>
-      <w:r>
-        <w:t>2</w:t>
-      </w:r>
-      <w:r>
-        <w:t>. Do nothing</w:t>
-      </w:r>
-    </w:p>
-    <w:p>
-      <w:pPr>
-        <w:pStyle w:val="Body"/>
-      </w:pPr>
-      <w:r>
-        <w:rPr>
-          <w:color w:val="FFC000"/>
-        </w:rPr>
-        <w:t>{%</w:t>
-      </w:r>
-      <w:r>
-        <w:rPr>
-          <w:color w:val="FFC000"/>
-        </w:rPr>
-        <w:t>p</w:t>
-      </w:r>
-      <w:r>
-        <w:rPr>
-          <w:color w:val="FFC000"/>
-        </w:rPr>
-        <w:t xml:space="preserve"> endif %}</w:t>
-      </w:r>
-    </w:p>
-    <w:p>
-      <w:pPr>
-        <w:pStyle w:val="Body"/>
-      </w:pPr>
-      <w:r>
         <w:t>If you are okay with the judge deciding the case based on {{ other_party_in_case }}’s Complaint, without hearing from you, you do not need to do anything.</w:t>
       </w:r>
     </w:p>
@@ -1370,19 +1382,7 @@
         <w:rPr>
           <w:color w:val="FF0000"/>
         </w:rPr>
-        <w:t>{%</w:t>
-      </w:r>
-      <w:r>
-        <w:rPr>
-          <w:color w:val="FF0000"/>
-        </w:rPr>
-        <w:t>p</w:t>
-      </w:r>
-      <w:r>
-        <w:rPr>
-          <w:color w:val="FF0000"/>
-        </w:rPr>
-        <w:t xml:space="preserve"> if type_of_response['default'] and stage_of_default == 'judgment entered' and type_of_response['case in 2 states'] and stage_of_other_case == 'ended with order' %}</w:t>
+        <w:t>{%p if type_of_response['default'] and stage_of_default == 'judgment entered' and type_of_response['case in 2 states'] and stage_of_other_case == 'ended with order' %}</w:t>
       </w:r>
     </w:p>
     <w:p>

</xml_diff>

<commit_message>
removing conditions that reference dismiss_step in default options_step and content.docx
</commit_message>
<xml_diff>
--- a/docassemble/AKA2JBranding/data/templates/default_options_content.docx
+++ b/docassemble/AKA2JBranding/data/templates/default_options_content.docx
@@ -1214,25 +1214,16 @@
         <w:t xml:space="preserve"> </w:t>
       </w:r>
       <w:r>
-        <w:t>that tells the court why you think you were not served properly.</w:t>
-      </w:r>
-      <w:r>
-        <w:rPr>
-          <w:color w:val="92D050"/>
-        </w:rPr>
-        <w:t>{% if user_need == 'answer divorce' or (user_need == 'answer custody' and not jurisdiction)%}</w:t>
+        <w:t>that tells the court why you think you were not served properly</w:t>
+      </w:r>
+      <w:r>
+        <w:t>.</w:t>
       </w:r>
       <w:r>
         <w:t xml:space="preserve"> </w:t>
       </w:r>
       <w:r>
         <w:t>See {{ dismiss_step.subject }}.</w:t>
-      </w:r>
-      <w:r>
-        <w:rPr>
-          <w:color w:val="92D050"/>
-        </w:rPr>
-        <w:t>{% endif %}</w:t>
       </w:r>
     </w:p>
     <w:p>

</xml_diff>